<commit_message>
Revise SEO ROI content doc: plainer language, merge with v3 depth
Rewrites the Word deliverable to plain, conversational language and
folds in the structure and depth of the user's v3 draft (mode
breakdowns, interpretation bands, formula reference, input-sourcing
table, methodology, expanded FAQ). Condenses the over-explained
audience section into a single role table and adds worked examples
and the SEO meta block.

Co-Authored-By: Claude Opus 4.8 <noreply@anthropic.com>
Claude-Session: https://claude.ai/code/session_01VAsSMDzAEWRimZVBgGcsUK
</commit_message>
<xml_diff>
--- a/Enterprise-SEO-ROI-Calculator-Content.docx
+++ b/Enterprise-SEO-ROI-Calculator-Content.docx
@@ -19,9 +19,77 @@
       </w:pPr>
       <w:r>
         <w:rPr>
-          <w:i/>
+          <w:b/>
         </w:rPr>
-        <w:t>On-page content for goldflexmarketing.com</w:t>
+        <w:t>Two calculation modes, one tool. Built for marketing teams and the CFOs who sign off their budgets.</w:t>
+      </w:r>
+    </w:p>
+    <w:tbl>
+      <w:tblPr>
+        <w:tblStyle w:val="LightList-Accent1"/>
+        <w:tblW w:type="auto" w:w="0"/>
+        <w:tblLook w:firstColumn="1" w:firstRow="1" w:lastColumn="0" w:lastRow="0" w:noHBand="0" w:noVBand="1" w:val="04A0"/>
+      </w:tblPr>
+      <w:tblGrid>
+        <w:gridCol w:w="8640"/>
+      </w:tblGrid>
+      <w:tr>
+        <w:tc>
+          <w:tcPr>
+            <w:tcW w:type="dxa" w:w="8640"/>
+          </w:tcPr>
+          <w:p>
+            <w:r>
+              <w:rPr>
+                <w:b/>
+              </w:rPr>
+              <w:t>SEO meta (for the page &lt;head&gt;)</w:t>
+            </w:r>
+          </w:p>
+          <w:p>
+            <w:r>
+              <w:rPr>
+                <w:b/>
+              </w:rPr>
+              <w:t xml:space="preserve">Title tag: </w:t>
+            </w:r>
+            <w:r>
+              <w:t xml:space="preserve">Enterprise SEO ROI Calculator | Goldflex Marketing  </w:t>
+            </w:r>
+            <w:r>
+              <w:rPr>
+                <w:i/>
+              </w:rPr>
+              <w:t>(54 characters)</w:t>
+            </w:r>
+          </w:p>
+          <w:p>
+            <w:r>
+              <w:rPr>
+                <w:b/>
+              </w:rPr>
+              <w:t xml:space="preserve">Meta description: </w:t>
+            </w:r>
+            <w:r>
+              <w:t xml:space="preserve">Free enterprise SEO ROI calculator. Enter your traffic, conversions, and spend to see projected revenue, ROI, LTV:CAC, and payback in seconds.  </w:t>
+            </w:r>
+            <w:r>
+              <w:rPr>
+                <w:i/>
+              </w:rPr>
+              <w:t>(148 characters)</w:t>
+            </w:r>
+          </w:p>
+        </w:tc>
+      </w:tr>
+    </w:tbl>
+    <w:p/>
+    <w:p>
+      <w:pPr>
+        <w:spacing w:after="120"/>
+      </w:pPr>
+      <w:r>
+        <w:t>Use this enterprise SEO ROI calculator to turn your traffic, conversions, and budget into a clear revenue and return picture. Enter a few numbers you already track, and you will see your projected organic search revenue, your net return, and your ROI as a percentage. There is no signup, and you can export the whole thing as a branded PDF for your team or your CFO.</w:t>
       </w:r>
     </w:p>
     <w:p>
@@ -29,21 +97,18 @@
         <w:spacing w:after="120"/>
       </w:pPr>
       <w:r>
-        <w:rPr>
-          <w:i/>
-        </w:rPr>
-        <w:t>Prepared as an SEO content brief and deploy-ready copy. Parts 1 and 2 are working notes; Part 3 is the page content to publish.</w:t>
+        <w:t>SEO is not really a cost. It is a budget decision, and like any budget decision it should be backed by numbers. This tool gives you two ways to show those numbers: a fast Quick ROI estimate for a campaign-specific revenue forecast, and a CFO-grade LTV:CAC model for a board-ready case. Set your time frame, enter your figures, and get six live results. No spreadsheets needed.</w:t>
       </w:r>
     </w:p>
     <w:p>
       <w:pPr>
-        <w:pStyle w:val="Heading1"/>
+        <w:pStyle w:val="Heading2"/>
       </w:pPr>
       <w:r>
         <w:rPr>
-          <w:color w:val="B88600"/>
+          <w:color w:val="1A1612"/>
         </w:rPr>
-        <w:t>Part 1 — Competitor-pattern summary</w:t>
+        <w:t>What is an enterprise SEO ROI calculator?</w:t>
       </w:r>
     </w:p>
     <w:p>
@@ -51,28 +116,23 @@
         <w:spacing w:after="120"/>
       </w:pPr>
       <w:r>
-        <w:rPr>
-          <w:i/>
-        </w:rPr>
-        <w:t>Method note: the major SEO domains (Ahrefs, Semrush, BrightEdge, agency tool pages) block automated scraping, so the structural read below comes from the live SERP results, snippets, and People Also Ask data for the primary keyword plus four related queries. Treat heading-level detail as directional.</w:t>
+        <w:t>It is a tool that turns organic search performance into numbers the whole business can act on: revenue, return on investment, customer lifetime value, and acquisition cost.</w:t>
       </w:r>
     </w:p>
     <w:p>
       <w:pPr>
-        <w:pStyle w:val="ListBullet"/>
-        <w:spacing w:after="60"/>
+        <w:spacing w:after="120"/>
       </w:pPr>
       <w:r>
-        <w:t>Two page types rank for this term: working "tool" pages and "explainer" posts. The winners do both, a calculator up top with supporting copy underneath. The calculator is built, so the content fills the "underneath" half.</w:t>
+        <w:t>Most SEO reports stop at rankings and traffic. Those numbers do not belong in a budget meeting. Revenue does. Net return does. The LTV:CAC ratio does. This calculator covers that gap.</w:t>
       </w:r>
     </w:p>
     <w:p>
       <w:pPr>
-        <w:pStyle w:val="ListBullet"/>
-        <w:spacing w:after="60"/>
+        <w:spacing w:after="120"/>
       </w:pPr>
       <w:r>
-        <w:t>Section topics that repeat across most top pages (all are expected): what the calculator does and who it is for, what to enter, how the math works, a worked example, what a good SEO ROI looks like, how long SEO takes to pay back, and an FAQ.</w:t>
+        <w:t>Enterprise SEO runs at a scale where the money is big enough to model properly. Large sites, competitive keywords, long sales cycles, and buying decisions with many people involved all change how that revenue shows up. So the tool gives you two modes for two different conversations:</w:t>
       </w:r>
     </w:p>
     <w:p>
@@ -81,7 +141,13 @@
         <w:spacing w:after="60"/>
       </w:pPr>
       <w:r>
-        <w:t>Shared keyword placement: the exact phrase sits in the title tag, H1, and first sentence, then shifts to synonyms and component terms (organic traffic, conversion rate, average order value, return on investment). Headings are mostly questions.</w:t>
+        <w:rPr>
+          <w:b/>
+        </w:rPr>
+        <w:t>Quick ROI</w:t>
+      </w:r>
+      <w:r>
+        <w:t xml:space="preserve"> for CMOs, marketing managers, and agency teams who need a fast, campaign-specific revenue and return number.</w:t>
       </w:r>
     </w:p>
     <w:p>
@@ -90,36 +156,1560 @@
         <w:spacing w:after="60"/>
       </w:pPr>
       <w:r>
-        <w:t>Reading level and tone to match: plain and conversational, short sentences, active voice, second person, contractions, concrete dollar figures. Jargon like LTV and CAC defined in one line on first use.</w:t>
+        <w:rPr>
+          <w:b/>
+        </w:rPr>
+        <w:t>CFO Mode</w:t>
+      </w:r>
+      <w:r>
+        <w:t xml:space="preserve"> for finance teams, investors, and C-suite slides that need LTV, CAC, NPV, and margin-adjusted returns.</w:t>
+      </w:r>
+    </w:p>
+    <w:tbl>
+      <w:tblPr>
+        <w:tblStyle w:val="LightShading-Accent1"/>
+        <w:tblW w:type="auto" w:w="0"/>
+        <w:tblLook w:firstColumn="1" w:firstRow="1" w:lastColumn="0" w:lastRow="0" w:noHBand="0" w:noVBand="1" w:val="04A0"/>
+      </w:tblPr>
+      <w:tblGrid>
+        <w:gridCol w:w="8640"/>
+      </w:tblGrid>
+      <w:tr>
+        <w:tc>
+          <w:tcPr>
+            <w:tcW w:type="dxa" w:w="8640"/>
+          </w:tcPr>
+          <w:p>
+            <w:r>
+              <w:rPr>
+                <w:b/>
+                <w:color w:val="B88600"/>
+              </w:rPr>
+              <w:t>Why two modes?</w:t>
+            </w:r>
+          </w:p>
+          <w:p>
+            <w:r>
+              <w:t>One formula cannot serve both a marketing director building a Q3 pitch and a CFO weighing where to put capital. Quick ROI uses campaign revenue logic: set your duration, get your total return. CFO Mode uses unit economics, the language finance already speaks. Most calculators do one of these, and rarely well.</w:t>
+            </w:r>
+          </w:p>
+        </w:tc>
+      </w:tr>
+    </w:tbl>
+    <w:p/>
+    <w:p>
+      <w:pPr>
+        <w:pStyle w:val="Heading2"/>
+      </w:pPr>
+      <w:r>
+        <w:rPr>
+          <w:color w:val="1A1612"/>
+        </w:rPr>
+        <w:t>Mode 1: Quick ROI for campaign revenue and return</w:t>
       </w:r>
     </w:p>
     <w:p>
       <w:pPr>
-        <w:pStyle w:val="ListBullet"/>
-        <w:spacing w:after="60"/>
+        <w:spacing w:after="120"/>
       </w:pPr>
       <w:r>
-        <w:t>Benchmark consensus to reuse (as estimates, never guarantees): 300 to 500 percent or higher is a strong SEO ROI, an LTV:CAC of 3:1 or higher is healthy, and payback usually lands in 6 to 12 months.</w:t>
+        <w:t>Quick ROI answers the question that starts every budget conversation: what will this campaign actually return over its run? Five inputs every marketing team can pull, six results that update live as you type or drag the slider.</w:t>
       </w:r>
     </w:p>
     <w:p>
       <w:pPr>
-        <w:pStyle w:val="ListBullet"/>
-        <w:spacing w:after="60"/>
+        <w:pStyle w:val="Heading3"/>
       </w:pPr>
       <w:r>
-        <w:t>The gap and ranking opportunity: most competing calculators stop at the simple model. Only Ahrefs pushes into LTV:CAC and present-value thinking. This tool already does that in CFO Mode, so leading with the CFO-grade framing in plain English out-covers the field. Attribution (brand vs non-brand, first-touch) is a second small gap, handled in the FAQ.</w:t>
+        <w:rPr>
+          <w:color w:val="1A1612"/>
+        </w:rPr>
+        <w:t>What you enter</w:t>
       </w:r>
     </w:p>
     <w:p>
       <w:pPr>
-        <w:pStyle w:val="Heading1"/>
+        <w:pStyle w:val="ListBullet"/>
+        <w:spacing w:after="60"/>
       </w:pPr>
       <w:r>
         <w:rPr>
-          <w:color w:val="B88600"/>
+          <w:b/>
         </w:rPr>
-        <w:t>Part 2 — Keyword map</w:t>
+        <w:t>Monthly organic traffic.</w:t>
+      </w:r>
+      <w:r>
+        <w:t xml:space="preserve"> Visitors who reach your site from organic search each month. Pull it from Google Search Console (Performance, then Total Clicks filtered to organic) or GA4 (Traffic Acquisition, then Organic Search).</w:t>
+      </w:r>
+    </w:p>
+    <w:p>
+      <w:pPr>
+        <w:pStyle w:val="ListBullet"/>
+        <w:spacing w:after="60"/>
+      </w:pPr>
+      <w:r>
+        <w:rPr>
+          <w:b/>
+        </w:rPr>
+        <w:t>Conversion rate (%).</w:t>
+      </w:r>
+      <w:r>
+        <w:t xml:space="preserve"> The share of organic visitors who become a customer or qualified lead. For most enterprise sites this is 1% to 3%. For B2B, count only marketing qualified leads, not every form fill.</w:t>
+      </w:r>
+    </w:p>
+    <w:p>
+      <w:pPr>
+        <w:pStyle w:val="ListBullet"/>
+        <w:spacing w:after="60"/>
+      </w:pPr>
+      <w:r>
+        <w:rPr>
+          <w:b/>
+        </w:rPr>
+        <w:t>Average order or deal value ($).</w:t>
+      </w:r>
+      <w:r>
+        <w:t xml:space="preserve"> Average revenue per conversion. For e-commerce, your basket size. For B2B, your average closed deal over the last 12 months from the CRM.</w:t>
+      </w:r>
+    </w:p>
+    <w:p>
+      <w:pPr>
+        <w:pStyle w:val="ListBullet"/>
+        <w:spacing w:after="60"/>
+      </w:pPr>
+      <w:r>
+        <w:rPr>
+          <w:b/>
+        </w:rPr>
+        <w:t>Monthly SEO investment ($).</w:t>
+      </w:r>
+      <w:r>
+        <w:t xml:space="preserve"> Your all-in monthly cost: agency fees, internal team time (salary in proportion to SEO hours), tools, content, and dev hours.</w:t>
+      </w:r>
+    </w:p>
+    <w:p>
+      <w:pPr>
+        <w:pStyle w:val="ListBullet"/>
+        <w:spacing w:after="60"/>
+      </w:pPr>
+      <w:r>
+        <w:rPr>
+          <w:b/>
+        </w:rPr>
+        <w:t>Campaign duration (months).</w:t>
+      </w:r>
+      <w:r>
+        <w:t xml:space="preserve"> How many months you are modeling, from 1 to 36. Drag the slider or type it in. The result labels update on their own, so a 6-month run shows "6-Month Revenue" and a 24-month run shows "24-Month Revenue". A common pick is 6 months for a pilot, 12 for an annual plan, and 18 to 24 for a strategic case.</w:t>
+      </w:r>
+    </w:p>
+    <w:p>
+      <w:pPr>
+        <w:pStyle w:val="Heading3"/>
+      </w:pPr>
+      <w:r>
+        <w:rPr>
+          <w:color w:val="1A1612"/>
+        </w:rPr>
+        <w:t>What you get: six live results</w:t>
+      </w:r>
+    </w:p>
+    <w:p>
+      <w:pPr>
+        <w:pStyle w:val="ListBullet"/>
+        <w:spacing w:after="60"/>
+      </w:pPr>
+      <w:r>
+        <w:rPr>
+          <w:b/>
+        </w:rPr>
+        <w:t>Monthly revenue.</w:t>
+      </w:r>
+      <w:r>
+        <w:t xml:space="preserve"> Traffic times (conversion rate divided by 100) times order value. Your baseline monthly contribution from organic search.</w:t>
+      </w:r>
+    </w:p>
+    <w:p>
+      <w:pPr>
+        <w:pStyle w:val="ListBullet"/>
+        <w:spacing w:after="60"/>
+      </w:pPr>
+      <w:r>
+        <w:rPr>
+          <w:b/>
+        </w:rPr>
+        <w:t>Campaign revenue.</w:t>
+      </w:r>
+      <w:r>
+        <w:t xml:space="preserve"> Monthly revenue across the full duration. The label matches your time frame.</w:t>
+      </w:r>
+    </w:p>
+    <w:p>
+      <w:pPr>
+        <w:pStyle w:val="ListBullet"/>
+        <w:spacing w:after="60"/>
+      </w:pPr>
+      <w:r>
+        <w:rPr>
+          <w:b/>
+        </w:rPr>
+        <w:t>Campaign investment.</w:t>
+      </w:r>
+      <w:r>
+        <w:t xml:space="preserve"> Monthly spend times duration. This is the total number that goes in your budget request.</w:t>
+      </w:r>
+    </w:p>
+    <w:p>
+      <w:pPr>
+        <w:pStyle w:val="ListBullet"/>
+        <w:spacing w:after="60"/>
+      </w:pPr>
+      <w:r>
+        <w:rPr>
+          <w:b/>
+        </w:rPr>
+        <w:t>Net return.</w:t>
+      </w:r>
+      <w:r>
+        <w:t xml:space="preserve"> Campaign revenue minus campaign investment. The dollars left over. Green when positive, orange when negative. The most direct answer to "is this worth it?"</w:t>
+      </w:r>
+    </w:p>
+    <w:p>
+      <w:pPr>
+        <w:pStyle w:val="ListBullet"/>
+        <w:spacing w:after="60"/>
+      </w:pPr>
+      <w:r>
+        <w:rPr>
+          <w:b/>
+        </w:rPr>
+        <w:t>ROI %.</w:t>
+      </w:r>
+      <w:r>
+        <w:t xml:space="preserve"> Net return divided by investment, times 100. Shown with a plain-English label like "for every $1 in, you get $X back". Turns orange when negative to flag a pre-breakeven position.</w:t>
+      </w:r>
+    </w:p>
+    <w:p>
+      <w:pPr>
+        <w:pStyle w:val="ListBullet"/>
+        <w:spacing w:after="60"/>
+      </w:pPr>
+      <w:r>
+        <w:rPr>
+          <w:b/>
+        </w:rPr>
+        <w:t>Return multiple.</w:t>
+      </w:r>
+      <w:r>
+        <w:t xml:space="preserve"> Campaign revenue divided by investment, shown as a multiplier like 5.0x. Often easier to land in a meeting than a percentage. "5x return" reads faster than "400%".</w:t>
+      </w:r>
+    </w:p>
+    <w:p>
+      <w:pPr>
+        <w:pStyle w:val="Heading3"/>
+      </w:pPr>
+      <w:r>
+        <w:rPr>
+          <w:color w:val="1A1612"/>
+        </w:rPr>
+        <w:t>A worked example</w:t>
+      </w:r>
+    </w:p>
+    <w:p>
+      <w:pPr>
+        <w:spacing w:after="120"/>
+      </w:pPr>
+      <w:r>
+        <w:t>Say you model a 12-month campaign with these numbers:</w:t>
+      </w:r>
+    </w:p>
+    <w:p>
+      <w:pPr>
+        <w:pStyle w:val="ListBullet"/>
+        <w:spacing w:after="60"/>
+      </w:pPr>
+      <w:r>
+        <w:t>Monthly organic traffic: 20,000</w:t>
+      </w:r>
+    </w:p>
+    <w:p>
+      <w:pPr>
+        <w:pStyle w:val="ListBullet"/>
+        <w:spacing w:after="60"/>
+      </w:pPr>
+      <w:r>
+        <w:t>Conversion rate: 1.5%</w:t>
+      </w:r>
+    </w:p>
+    <w:p>
+      <w:pPr>
+        <w:pStyle w:val="ListBullet"/>
+        <w:spacing w:after="60"/>
+      </w:pPr>
+      <w:r>
+        <w:t>Average order value: $100</w:t>
+      </w:r>
+    </w:p>
+    <w:p>
+      <w:pPr>
+        <w:pStyle w:val="ListBullet"/>
+        <w:spacing w:after="60"/>
+      </w:pPr>
+      <w:r>
+        <w:t>Monthly SEO investment: $6,000</w:t>
+      </w:r>
+    </w:p>
+    <w:p>
+      <w:pPr>
+        <w:spacing w:after="120"/>
+      </w:pPr>
+      <w:r>
+        <w:t>You get:</w:t>
+      </w:r>
+    </w:p>
+    <w:p>
+      <w:pPr>
+        <w:pStyle w:val="ListBullet"/>
+        <w:spacing w:after="60"/>
+      </w:pPr>
+      <w:r>
+        <w:t xml:space="preserve">Monthly revenue: </w:t>
+      </w:r>
+      <w:r>
+        <w:rPr>
+          <w:b/>
+        </w:rPr>
+        <w:t>$30,000</w:t>
+      </w:r>
+      <w:r>
+        <w:t xml:space="preserve"> (20,000 x 1.5% x $100)</w:t>
+      </w:r>
+    </w:p>
+    <w:p>
+      <w:pPr>
+        <w:pStyle w:val="ListBullet"/>
+        <w:spacing w:after="60"/>
+      </w:pPr>
+      <w:r>
+        <w:t xml:space="preserve">12-month revenue: </w:t>
+      </w:r>
+      <w:r>
+        <w:rPr>
+          <w:b/>
+        </w:rPr>
+        <w:t>$360,000</w:t>
+      </w:r>
+    </w:p>
+    <w:p>
+      <w:pPr>
+        <w:pStyle w:val="ListBullet"/>
+        <w:spacing w:after="60"/>
+      </w:pPr>
+      <w:r>
+        <w:t xml:space="preserve">12-month investment: </w:t>
+      </w:r>
+      <w:r>
+        <w:rPr>
+          <w:b/>
+        </w:rPr>
+        <w:t>$72,000</w:t>
+      </w:r>
+    </w:p>
+    <w:p>
+      <w:pPr>
+        <w:pStyle w:val="ListBullet"/>
+        <w:spacing w:after="60"/>
+      </w:pPr>
+      <w:r>
+        <w:t xml:space="preserve">Net return: </w:t>
+      </w:r>
+      <w:r>
+        <w:rPr>
+          <w:b/>
+        </w:rPr>
+        <w:t>$288,000</w:t>
+      </w:r>
+    </w:p>
+    <w:p>
+      <w:pPr>
+        <w:pStyle w:val="ListBullet"/>
+        <w:spacing w:after="60"/>
+      </w:pPr>
+      <w:r>
+        <w:t xml:space="preserve">SEO ROI: </w:t>
+      </w:r>
+      <w:r>
+        <w:rPr>
+          <w:b/>
+        </w:rPr>
+        <w:t>400%</w:t>
+      </w:r>
+    </w:p>
+    <w:p>
+      <w:pPr>
+        <w:pStyle w:val="ListBullet"/>
+        <w:spacing w:after="60"/>
+      </w:pPr>
+      <w:r>
+        <w:t xml:space="preserve">Return multiple: </w:t>
+      </w:r>
+      <w:r>
+        <w:rPr>
+          <w:b/>
+        </w:rPr>
+        <w:t>5x</w:t>
+      </w:r>
+    </w:p>
+    <w:p>
+      <w:pPr>
+        <w:spacing w:after="120"/>
+      </w:pPr>
+      <w:r>
+        <w:t>So this scenario projects $5 of revenue for every $1 spent on SEO over the year.</w:t>
+      </w:r>
+    </w:p>
+    <w:p>
+      <w:pPr>
+        <w:pStyle w:val="Heading3"/>
+      </w:pPr>
+      <w:r>
+        <w:rPr>
+          <w:color w:val="1A1612"/>
+        </w:rPr>
+        <w:t>How to read your Quick ROI result</w:t>
+      </w:r>
+    </w:p>
+    <w:p>
+      <w:pPr>
+        <w:pStyle w:val="ListBullet"/>
+        <w:spacing w:after="60"/>
+      </w:pPr>
+      <w:r>
+        <w:rPr>
+          <w:b/>
+        </w:rPr>
+        <w:t>ROI below 0% (net return negative).</w:t>
+      </w:r>
+      <w:r>
+        <w:t xml:space="preserve"> SEO has not turned revenue-positive at this duration yet. Most common in months 1 to 6 of a new program. Try a longer time frame, since profit often shows up by month 9 to 12.</w:t>
+      </w:r>
+    </w:p>
+    <w:p>
+      <w:pPr>
+        <w:pStyle w:val="ListBullet"/>
+        <w:spacing w:after="60"/>
+      </w:pPr>
+      <w:r>
+        <w:rPr>
+          <w:b/>
+        </w:rPr>
+        <w:t>ROI 0% to 200%.</w:t>
+      </w:r>
+      <w:r>
+        <w:t xml:space="preserve"> Building phase. You are covering costs and earning a return, but the compounding has not kicked in. Normal for months 6 to 18.</w:t>
+      </w:r>
+    </w:p>
+    <w:p>
+      <w:pPr>
+        <w:pStyle w:val="ListBullet"/>
+        <w:spacing w:after="60"/>
+      </w:pPr>
+      <w:r>
+        <w:rPr>
+          <w:b/>
+        </w:rPr>
+        <w:t>ROI 200% to 500%.</w:t>
+      </w:r>
+      <w:r>
+        <w:t xml:space="preserve"> Strong enterprise performance. Double-check your attribution so you are not counting cross-channel conversions twice.</w:t>
+      </w:r>
+    </w:p>
+    <w:p>
+      <w:pPr>
+        <w:pStyle w:val="ListBullet"/>
+        <w:spacing w:after="60"/>
+      </w:pPr>
+      <w:r>
+        <w:rPr>
+          <w:b/>
+        </w:rPr>
+        <w:t>ROI above 500%.</w:t>
+      </w:r>
+      <w:r>
+        <w:t xml:space="preserve"> Check your inputs. If they are right, the program is doing very well and you are probably underinvesting.</w:t>
+      </w:r>
+    </w:p>
+    <w:p>
+      <w:pPr>
+        <w:pStyle w:val="Heading2"/>
+      </w:pPr>
+      <w:r>
+        <w:rPr>
+          <w:color w:val="1A1612"/>
+        </w:rPr>
+        <w:t>Mode 2: CFO Mode for LTV, CAC, and NPV</w:t>
+      </w:r>
+    </w:p>
+    <w:p>
+      <w:pPr>
+        <w:spacing w:after="120"/>
+      </w:pPr>
+      <w:r>
+        <w:t>CFO Mode uses the unit-economics framework finance teams, investors, and boards already trust. It answers what no traffic report can: is our SEO building durable, high-quality customer relationships at a cost that makes sense?</w:t>
+      </w:r>
+    </w:p>
+    <w:p>
+      <w:pPr>
+        <w:pStyle w:val="Heading3"/>
+      </w:pPr>
+      <w:r>
+        <w:rPr>
+          <w:color w:val="1A1612"/>
+        </w:rPr>
+        <w:t>What you enter</w:t>
+      </w:r>
+    </w:p>
+    <w:p>
+      <w:pPr>
+        <w:pStyle w:val="ListBullet"/>
+        <w:spacing w:after="60"/>
+      </w:pPr>
+      <w:r>
+        <w:rPr>
+          <w:b/>
+        </w:rPr>
+        <w:t>Total SEO costs ($).</w:t>
+      </w:r>
+      <w:r>
+        <w:t xml:space="preserve"> All-in spend for the period: agency fees, internal salaries (in proportion to SEO time), tools, content, dev hours. This is the top of your CAC.</w:t>
+      </w:r>
+    </w:p>
+    <w:p>
+      <w:pPr>
+        <w:pStyle w:val="ListBullet"/>
+        <w:spacing w:after="60"/>
+      </w:pPr>
+      <w:r>
+        <w:rPr>
+          <w:b/>
+        </w:rPr>
+        <w:t>Customers acquired.</w:t>
+      </w:r>
+      <w:r>
+        <w:t xml:space="preserve"> New customers you can attribute to organic search over the same period, from CRM attribution.</w:t>
+      </w:r>
+    </w:p>
+    <w:p>
+      <w:pPr>
+        <w:pStyle w:val="ListBullet"/>
+        <w:spacing w:after="60"/>
+      </w:pPr>
+      <w:r>
+        <w:rPr>
+          <w:b/>
+        </w:rPr>
+        <w:t>Average revenue per customer ($).</w:t>
+      </w:r>
+      <w:r>
+        <w:t xml:space="preserve"> Total revenue divided by customers. For enterprise B2B this can run from tens of thousands into the hundreds of thousands. For SaaS, use annual contract value.</w:t>
+      </w:r>
+    </w:p>
+    <w:p>
+      <w:pPr>
+        <w:pStyle w:val="ListBullet"/>
+        <w:spacing w:after="60"/>
+      </w:pPr>
+      <w:r>
+        <w:rPr>
+          <w:b/>
+        </w:rPr>
+        <w:t>Annual churn rate (%).</w:t>
+      </w:r>
+      <w:r>
+        <w:t xml:space="preserve"> The share of customers you lose each year. It drives your retention period (1 divided by churn). Rough averages: SaaS 5% to 12%, e-commerce 20% to 35%, B2B services 8% to 15%.</w:t>
+      </w:r>
+    </w:p>
+    <w:p>
+      <w:pPr>
+        <w:pStyle w:val="ListBullet"/>
+        <w:spacing w:after="60"/>
+      </w:pPr>
+      <w:r>
+        <w:rPr>
+          <w:b/>
+        </w:rPr>
+        <w:t>Gross margin (%).</w:t>
+      </w:r>
+      <w:r>
+        <w:t xml:space="preserve"> What you keep after the cost of delivering the product or service. Adjusts LTV to real profit. SaaS 70% to 85%, e-commerce 40% to 60%, services 50% to 70%.</w:t>
+      </w:r>
+    </w:p>
+    <w:p>
+      <w:pPr>
+        <w:pStyle w:val="ListBullet"/>
+        <w:spacing w:after="60"/>
+      </w:pPr>
+      <w:r>
+        <w:rPr>
+          <w:b/>
+        </w:rPr>
+        <w:t>Discount rate (%).</w:t>
+      </w:r>
+      <w:r>
+        <w:t xml:space="preserve"> The time value of money applied to future revenue, used for the NPV of LTV. A dollar next year is worth a little less than a dollar today. Enterprise standard is 8% to 12%.</w:t>
+      </w:r>
+    </w:p>
+    <w:p>
+      <w:pPr>
+        <w:pStyle w:val="Heading3"/>
+      </w:pPr>
+      <w:r>
+        <w:rPr>
+          <w:color w:val="1A1612"/>
+        </w:rPr>
+        <w:t>What you get</w:t>
+      </w:r>
+    </w:p>
+    <w:p>
+      <w:pPr>
+        <w:pStyle w:val="ListBullet"/>
+        <w:spacing w:after="60"/>
+      </w:pPr>
+      <w:r>
+        <w:rPr>
+          <w:b/>
+        </w:rPr>
+        <w:t>Retention period.</w:t>
+      </w:r>
+      <w:r>
+        <w:t xml:space="preserve"> 1 divided by churn rate. A 10% churn means a 10-year average relationship. A 25% churn means 4 years.</w:t>
+      </w:r>
+    </w:p>
+    <w:p>
+      <w:pPr>
+        <w:pStyle w:val="ListBullet"/>
+        <w:spacing w:after="60"/>
+      </w:pPr>
+      <w:r>
+        <w:rPr>
+          <w:b/>
+        </w:rPr>
+        <w:t>Customer LTV.</w:t>
+      </w:r>
+      <w:r>
+        <w:t xml:space="preserve"> ARPC times retention period times (gross margin divided by 100). What one organic customer is worth over their whole relationship, after margin.</w:t>
+      </w:r>
+    </w:p>
+    <w:p>
+      <w:pPr>
+        <w:pStyle w:val="ListBullet"/>
+        <w:spacing w:after="60"/>
+      </w:pPr>
+      <w:r>
+        <w:rPr>
+          <w:b/>
+        </w:rPr>
+        <w:t>NPV of LTV.</w:t>
+      </w:r>
+      <w:r>
+        <w:t xml:space="preserve"> LTV divided by (1 plus discount rate). That lifetime value in today’s dollars. The version a CFO prefers.</w:t>
+      </w:r>
+    </w:p>
+    <w:p>
+      <w:pPr>
+        <w:pStyle w:val="ListBullet"/>
+        <w:spacing w:after="60"/>
+      </w:pPr>
+      <w:r>
+        <w:rPr>
+          <w:b/>
+        </w:rPr>
+        <w:t>SEO CAC.</w:t>
+      </w:r>
+      <w:r>
+        <w:t xml:space="preserve"> Total SEO costs divided by customers acquired. What it costs to win one customer through organic search. A $500 CAC against a $50,000 LTV is excellent. A $500 CAC against a $600 LTV is not.</w:t>
+      </w:r>
+    </w:p>
+    <w:p>
+      <w:pPr>
+        <w:pStyle w:val="ListBullet"/>
+        <w:spacing w:after="60"/>
+      </w:pPr>
+      <w:r>
+        <w:rPr>
+          <w:b/>
+        </w:rPr>
+        <w:t>ROI % (CFO model).</w:t>
+      </w:r>
+      <w:r>
+        <w:t xml:space="preserve"> ((NPV of LTV minus CAC) divided by CAC) times 100. Margin-adjusted and present-value corrected. The ROI that belongs in a board pack.</w:t>
+      </w:r>
+    </w:p>
+    <w:p>
+      <w:pPr>
+        <w:pStyle w:val="Heading3"/>
+      </w:pPr>
+      <w:r>
+        <w:rPr>
+          <w:color w:val="1A1612"/>
+        </w:rPr>
+        <w:t>A worked example</w:t>
+      </w:r>
+    </w:p>
+    <w:p>
+      <w:pPr>
+        <w:spacing w:after="120"/>
+      </w:pPr>
+      <w:r>
+        <w:t>Say your organic program looks like this:</w:t>
+      </w:r>
+    </w:p>
+    <w:p>
+      <w:pPr>
+        <w:pStyle w:val="ListBullet"/>
+        <w:spacing w:after="60"/>
+      </w:pPr>
+      <w:r>
+        <w:t>Total SEO costs: $120,000</w:t>
+      </w:r>
+    </w:p>
+    <w:p>
+      <w:pPr>
+        <w:pStyle w:val="ListBullet"/>
+        <w:spacing w:after="60"/>
+      </w:pPr>
+      <w:r>
+        <w:t>Customers acquired: 300</w:t>
+      </w:r>
+    </w:p>
+    <w:p>
+      <w:pPr>
+        <w:pStyle w:val="ListBullet"/>
+        <w:spacing w:after="60"/>
+      </w:pPr>
+      <w:r>
+        <w:t>Average revenue per customer: $800</w:t>
+      </w:r>
+    </w:p>
+    <w:p>
+      <w:pPr>
+        <w:pStyle w:val="ListBullet"/>
+        <w:spacing w:after="60"/>
+      </w:pPr>
+      <w:r>
+        <w:t>Annual churn: 15%</w:t>
+      </w:r>
+    </w:p>
+    <w:p>
+      <w:pPr>
+        <w:pStyle w:val="ListBullet"/>
+        <w:spacing w:after="60"/>
+      </w:pPr>
+      <w:r>
+        <w:t>Gross margin: 65%</w:t>
+      </w:r>
+    </w:p>
+    <w:p>
+      <w:pPr>
+        <w:pStyle w:val="ListBullet"/>
+        <w:spacing w:after="60"/>
+      </w:pPr>
+      <w:r>
+        <w:t>Discount rate: 10%</w:t>
+      </w:r>
+    </w:p>
+    <w:p>
+      <w:pPr>
+        <w:spacing w:after="120"/>
+      </w:pPr>
+      <w:r>
+        <w:t>You get:</w:t>
+      </w:r>
+    </w:p>
+    <w:p>
+      <w:pPr>
+        <w:pStyle w:val="ListBullet"/>
+        <w:spacing w:after="60"/>
+      </w:pPr>
+      <w:r>
+        <w:t xml:space="preserve">Retention period: </w:t>
+      </w:r>
+      <w:r>
+        <w:rPr>
+          <w:b/>
+        </w:rPr>
+        <w:t>6.7 years</w:t>
+      </w:r>
+      <w:r>
+        <w:t xml:space="preserve"> (1 ÷ 15%)</w:t>
+      </w:r>
+    </w:p>
+    <w:p>
+      <w:pPr>
+        <w:pStyle w:val="ListBullet"/>
+        <w:spacing w:after="60"/>
+      </w:pPr>
+      <w:r>
+        <w:t xml:space="preserve">Customer LTV: </w:t>
+      </w:r>
+      <w:r>
+        <w:rPr>
+          <w:b/>
+        </w:rPr>
+        <w:t>$3,467</w:t>
+      </w:r>
+    </w:p>
+    <w:p>
+      <w:pPr>
+        <w:pStyle w:val="ListBullet"/>
+        <w:spacing w:after="60"/>
+      </w:pPr>
+      <w:r>
+        <w:t xml:space="preserve">NPV of LTV: </w:t>
+      </w:r>
+      <w:r>
+        <w:rPr>
+          <w:b/>
+        </w:rPr>
+        <w:t>$3,151</w:t>
+      </w:r>
+    </w:p>
+    <w:p>
+      <w:pPr>
+        <w:pStyle w:val="ListBullet"/>
+        <w:spacing w:after="60"/>
+      </w:pPr>
+      <w:r>
+        <w:t xml:space="preserve">SEO CAC: </w:t>
+      </w:r>
+      <w:r>
+        <w:rPr>
+          <w:b/>
+        </w:rPr>
+        <w:t>$400</w:t>
+      </w:r>
+      <w:r>
+        <w:t xml:space="preserve"> ($120,000 ÷ 300)</w:t>
+      </w:r>
+    </w:p>
+    <w:p>
+      <w:pPr>
+        <w:pStyle w:val="ListBullet"/>
+        <w:spacing w:after="60"/>
+      </w:pPr>
+      <w:r>
+        <w:t xml:space="preserve">SEO ROI: </w:t>
+      </w:r>
+      <w:r>
+        <w:rPr>
+          <w:b/>
+        </w:rPr>
+        <w:t>about 688%</w:t>
+      </w:r>
+    </w:p>
+    <w:p>
+      <w:pPr>
+        <w:pStyle w:val="ListBullet"/>
+        <w:spacing w:after="60"/>
+      </w:pPr>
+      <w:r>
+        <w:t xml:space="preserve">LTV:CAC: </w:t>
+      </w:r>
+      <w:r>
+        <w:rPr>
+          <w:b/>
+        </w:rPr>
+        <w:t>8.7:1</w:t>
+      </w:r>
+      <w:r>
+        <w:t xml:space="preserve">, rated </w:t>
+      </w:r>
+      <w:r>
+        <w:rPr>
+          <w:b/>
+        </w:rPr>
+        <w:t>Strong</w:t>
+      </w:r>
+    </w:p>
+    <w:p>
+      <w:pPr>
+        <w:spacing w:after="120"/>
+      </w:pPr>
+      <w:r>
+        <w:t>Same channel, two stories. Quick ROI proves the revenue. CFO Mode proves the customer is worth far more than it cost to win, which is the argument finance responds to.</w:t>
+      </w:r>
+    </w:p>
+    <w:p>
+      <w:pPr>
+        <w:pStyle w:val="Heading3"/>
+      </w:pPr>
+      <w:r>
+        <w:rPr>
+          <w:color w:val="1A1612"/>
+        </w:rPr>
+        <w:t>The LTV:CAC health score</w:t>
+      </w:r>
+    </w:p>
+    <w:p>
+      <w:pPr>
+        <w:spacing w:after="120"/>
+      </w:pPr>
+      <w:r>
+        <w:t>The LTV:CAC ratio is the single most useful number in the tool. A color-coded gauge shows where you stand:</w:t>
+      </w:r>
+    </w:p>
+    <w:p>
+      <w:pPr>
+        <w:pStyle w:val="ListBullet"/>
+        <w:spacing w:after="60"/>
+      </w:pPr>
+      <w:r>
+        <w:rPr>
+          <w:b/>
+        </w:rPr>
+        <w:t>Below 1:1.</w:t>
+      </w:r>
+      <w:r>
+        <w:t xml:space="preserve"> Below break-even. You are spending more to win customers than they are worth.</w:t>
+      </w:r>
+    </w:p>
+    <w:p>
+      <w:pPr>
+        <w:pStyle w:val="ListBullet"/>
+        <w:spacing w:after="60"/>
+      </w:pPr>
+      <w:r>
+        <w:rPr>
+          <w:b/>
+        </w:rPr>
+        <w:t>1:1 to 3:1.</w:t>
+      </w:r>
+      <w:r>
+        <w:t xml:space="preserve"> Marginal. Revenue-positive, but the unit economics are tight. Fix conversion rate, churn, or deal size before you scale spend.</w:t>
+      </w:r>
+    </w:p>
+    <w:p>
+      <w:pPr>
+        <w:pStyle w:val="ListBullet"/>
+        <w:spacing w:after="60"/>
+      </w:pPr>
+      <w:r>
+        <w:rPr>
+          <w:b/>
+        </w:rPr>
+        <w:t>3:1 to 5:1.</w:t>
+      </w:r>
+      <w:r>
+        <w:t xml:space="preserve"> Healthy. The standard benchmark for a digital acquisition channel that is working.</w:t>
+      </w:r>
+    </w:p>
+    <w:p>
+      <w:pPr>
+        <w:pStyle w:val="ListBullet"/>
+        <w:spacing w:after="60"/>
+      </w:pPr>
+      <w:r>
+        <w:rPr>
+          <w:b/>
+        </w:rPr>
+        <w:t>5:1 to 10:1.</w:t>
+      </w:r>
+      <w:r>
+        <w:t xml:space="preserve"> Strong. You are probably underinvesting. Each extra dollar of SEO spend at this ratio adds real lifetime value.</w:t>
+      </w:r>
+    </w:p>
+    <w:p>
+      <w:pPr>
+        <w:pStyle w:val="ListBullet"/>
+        <w:spacing w:after="60"/>
+      </w:pPr>
+      <w:r>
+        <w:rPr>
+          <w:b/>
+        </w:rPr>
+        <w:t>Above 10:1.</w:t>
+      </w:r>
+      <w:r>
+        <w:t xml:space="preserve"> Exceptional. Take this to your CFO as the case for a bigger budget.</w:t>
+      </w:r>
+    </w:p>
+    <w:tbl>
+      <w:tblPr>
+        <w:tblStyle w:val="LightShading-Accent1"/>
+        <w:tblW w:type="auto" w:w="0"/>
+        <w:tblLook w:firstColumn="1" w:firstRow="1" w:lastColumn="0" w:lastRow="0" w:noHBand="0" w:noVBand="1" w:val="04A0"/>
+      </w:tblPr>
+      <w:tblGrid>
+        <w:gridCol w:w="8640"/>
+      </w:tblGrid>
+      <w:tr>
+        <w:tc>
+          <w:tcPr>
+            <w:tcW w:type="dxa" w:w="8640"/>
+          </w:tcPr>
+          <w:p>
+            <w:r>
+              <w:rPr>
+                <w:b/>
+                <w:color w:val="B88600"/>
+              </w:rPr>
+              <w:t>The CFO Mode insight most teams miss</w:t>
+            </w:r>
+          </w:p>
+          <w:p>
+            <w:r>
+              <w:t>If your LTV:CAC is above 5:1, you are almost certainly underspending on SEO. Teams that see this ratio for the first time often realize they have been holding back one of their most efficient acquisition channels. This is the conversation that grows SEO budgets.</w:t>
+            </w:r>
+          </w:p>
+        </w:tc>
+      </w:tr>
+    </w:tbl>
+    <w:p/>
+    <w:p>
+      <w:pPr>
+        <w:pStyle w:val="Heading2"/>
+      </w:pPr>
+      <w:r>
+        <w:rPr>
+          <w:color w:val="1A1612"/>
+        </w:rPr>
+        <w:t>How to use it, step by step</w:t>
+      </w:r>
+    </w:p>
+    <w:p>
+      <w:pPr>
+        <w:pStyle w:val="Heading3"/>
+      </w:pPr>
+      <w:r>
+        <w:rPr>
+          <w:color w:val="1A1612"/>
+        </w:rPr>
+        <w:t>Step 1: Pick your mode</w:t>
+      </w:r>
+    </w:p>
+    <w:p>
+      <w:pPr>
+        <w:spacing w:after="120"/>
+      </w:pPr>
+      <w:r>
+        <w:t>Use Quick ROI when you need a campaign revenue and return figure for a proposal, a report, or a budget chat. It is also the right place to start if you do not have churn or margin data yet. Use CFO Mode when you are building a board slide, asking for more budget, comparing SEO against other channels, or making a multi-year case.</w:t>
+      </w:r>
+    </w:p>
+    <w:p>
+      <w:pPr>
+        <w:pStyle w:val="Heading3"/>
+      </w:pPr>
+      <w:r>
+        <w:rPr>
+          <w:color w:val="1A1612"/>
+        </w:rPr>
+        <w:t>Step 2: Set your duration first (Quick ROI)</w:t>
+      </w:r>
+    </w:p>
+    <w:p>
+      <w:pPr>
+        <w:spacing w:after="120"/>
+      </w:pPr>
+      <w:r>
+        <w:t>Drag the duration slider before you enter anything else. It anchors the whole calculation to the right time frame. A 6-month pilot, a 12-month plan, and a 24-month program are three different conversations.</w:t>
+      </w:r>
+    </w:p>
+    <w:p>
+      <w:pPr>
+        <w:pStyle w:val="Heading3"/>
+      </w:pPr>
+      <w:r>
+        <w:rPr>
+          <w:color w:val="1A1612"/>
+        </w:rPr>
+        <w:t>Step 3: Source your inputs correctly</w:t>
+      </w:r>
+    </w:p>
+    <w:p>
+      <w:pPr>
+        <w:spacing w:after="120"/>
+      </w:pPr>
+      <w:r>
+        <w:t>Your result is only as good as your inputs. Here is where to find each one:</w:t>
+      </w:r>
+    </w:p>
+    <w:tbl>
+      <w:tblPr>
+        <w:tblStyle w:val="LightGrid-Accent1"/>
+        <w:tblW w:type="auto" w:w="0"/>
+        <w:tblLook w:firstColumn="1" w:firstRow="1" w:lastColumn="0" w:lastRow="0" w:noHBand="0" w:noVBand="1" w:val="04A0"/>
+      </w:tblPr>
+      <w:tblGrid>
+        <w:gridCol w:w="2880"/>
+        <w:gridCol w:w="2880"/>
+        <w:gridCol w:w="2880"/>
+      </w:tblGrid>
+      <w:tr>
+        <w:tc>
+          <w:tcPr>
+            <w:tcW w:type="dxa" w:w="2880"/>
+          </w:tcPr>
+          <w:p>
+            <w:r>
+              <w:rPr>
+                <w:b/>
+              </w:rPr>
+              <w:t>Input</w:t>
+            </w:r>
+          </w:p>
+        </w:tc>
+        <w:tc>
+          <w:tcPr>
+            <w:tcW w:type="dxa" w:w="2880"/>
+          </w:tcPr>
+          <w:p>
+            <w:r>
+              <w:rPr>
+                <w:b/>
+              </w:rPr>
+              <w:t>Where to find it</w:t>
+            </w:r>
+          </w:p>
+        </w:tc>
+        <w:tc>
+          <w:tcPr>
+            <w:tcW w:type="dxa" w:w="2880"/>
+          </w:tcPr>
+          <w:p>
+            <w:r>
+              <w:rPr>
+                <w:b/>
+              </w:rPr>
+              <w:t>Mode</w:t>
+            </w:r>
+          </w:p>
+        </w:tc>
+      </w:tr>
+      <w:tr>
+        <w:tc>
+          <w:tcPr>
+            <w:tcW w:type="dxa" w:w="2880"/>
+          </w:tcPr>
+          <w:p>
+            <w:r>
+              <w:t>Monthly organic traffic</w:t>
+            </w:r>
+          </w:p>
+        </w:tc>
+        <w:tc>
+          <w:tcPr>
+            <w:tcW w:type="dxa" w:w="2880"/>
+          </w:tcPr>
+          <w:p>
+            <w:r>
+              <w:t>Search Console &gt; Performance &gt; Total Clicks (organic)</w:t>
+            </w:r>
+          </w:p>
+        </w:tc>
+        <w:tc>
+          <w:tcPr>
+            <w:tcW w:type="dxa" w:w="2880"/>
+          </w:tcPr>
+          <w:p>
+            <w:r>
+              <w:t>Quick ROI</w:t>
+            </w:r>
+          </w:p>
+        </w:tc>
+      </w:tr>
+      <w:tr>
+        <w:tc>
+          <w:tcPr>
+            <w:tcW w:type="dxa" w:w="2880"/>
+          </w:tcPr>
+          <w:p>
+            <w:r>
+              <w:t>Conversion rate (%)</w:t>
+            </w:r>
+          </w:p>
+        </w:tc>
+        <w:tc>
+          <w:tcPr>
+            <w:tcW w:type="dxa" w:w="2880"/>
+          </w:tcPr>
+          <w:p>
+            <w:r>
+              <w:t>GA4: conversions ÷ organic sessions. B2B: MQL form fills only</w:t>
+            </w:r>
+          </w:p>
+        </w:tc>
+        <w:tc>
+          <w:tcPr>
+            <w:tcW w:type="dxa" w:w="2880"/>
+          </w:tcPr>
+          <w:p>
+            <w:r>
+              <w:t>Quick ROI</w:t>
+            </w:r>
+          </w:p>
+        </w:tc>
+      </w:tr>
+      <w:tr>
+        <w:tc>
+          <w:tcPr>
+            <w:tcW w:type="dxa" w:w="2880"/>
+          </w:tcPr>
+          <w:p>
+            <w:r>
+              <w:t>Avg order / deal value ($)</w:t>
+            </w:r>
+          </w:p>
+        </w:tc>
+        <w:tc>
+          <w:tcPr>
+            <w:tcW w:type="dxa" w:w="2880"/>
+          </w:tcPr>
+          <w:p>
+            <w:r>
+              <w:t>CRM: revenue ÷ deals closed. Use a 12-month average</w:t>
+            </w:r>
+          </w:p>
+        </w:tc>
+        <w:tc>
+          <w:tcPr>
+            <w:tcW w:type="dxa" w:w="2880"/>
+          </w:tcPr>
+          <w:p>
+            <w:r>
+              <w:t>Quick ROI</w:t>
+            </w:r>
+          </w:p>
+        </w:tc>
+      </w:tr>
+      <w:tr>
+        <w:tc>
+          <w:tcPr>
+            <w:tcW w:type="dxa" w:w="2880"/>
+          </w:tcPr>
+          <w:p>
+            <w:r>
+              <w:t>Monthly SEO investment ($)</w:t>
+            </w:r>
+          </w:p>
+        </w:tc>
+        <w:tc>
+          <w:tcPr>
+            <w:tcW w:type="dxa" w:w="2880"/>
+          </w:tcPr>
+          <w:p>
+            <w:r>
+              <w:t>Agency + (salary x % of SEO time) + tools + content</w:t>
+            </w:r>
+          </w:p>
+        </w:tc>
+        <w:tc>
+          <w:tcPr>
+            <w:tcW w:type="dxa" w:w="2880"/>
+          </w:tcPr>
+          <w:p>
+            <w:r>
+              <w:t>Quick ROI</w:t>
+            </w:r>
+          </w:p>
+        </w:tc>
+      </w:tr>
+      <w:tr>
+        <w:tc>
+          <w:tcPr>
+            <w:tcW w:type="dxa" w:w="2880"/>
+          </w:tcPr>
+          <w:p>
+            <w:r>
+              <w:t>Campaign duration (months)</w:t>
+            </w:r>
+          </w:p>
+        </w:tc>
+        <w:tc>
+          <w:tcPr>
+            <w:tcW w:type="dxa" w:w="2880"/>
+          </w:tcPr>
+          <w:p>
+            <w:r>
+              <w:t>Drag slider 1 to 36. Labels update automatically</w:t>
+            </w:r>
+          </w:p>
+        </w:tc>
+        <w:tc>
+          <w:tcPr>
+            <w:tcW w:type="dxa" w:w="2880"/>
+          </w:tcPr>
+          <w:p>
+            <w:r>
+              <w:t>Quick ROI</w:t>
+            </w:r>
+          </w:p>
+        </w:tc>
+      </w:tr>
+      <w:tr>
+        <w:tc>
+          <w:tcPr>
+            <w:tcW w:type="dxa" w:w="2880"/>
+          </w:tcPr>
+          <w:p>
+            <w:r>
+              <w:t>Total SEO costs ($)</w:t>
+            </w:r>
+          </w:p>
+        </w:tc>
+        <w:tc>
+          <w:tcPr>
+            <w:tcW w:type="dxa" w:w="2880"/>
+          </w:tcPr>
+          <w:p>
+            <w:r>
+              <w:t>All-in: agency, tools, internal team, content, dev</w:t>
+            </w:r>
+          </w:p>
+        </w:tc>
+        <w:tc>
+          <w:tcPr>
+            <w:tcW w:type="dxa" w:w="2880"/>
+          </w:tcPr>
+          <w:p>
+            <w:r>
+              <w:t>CFO Mode</w:t>
+            </w:r>
+          </w:p>
+        </w:tc>
+      </w:tr>
+      <w:tr>
+        <w:tc>
+          <w:tcPr>
+            <w:tcW w:type="dxa" w:w="2880"/>
+          </w:tcPr>
+          <w:p>
+            <w:r>
+              <w:t>Customers acquired</w:t>
+            </w:r>
+          </w:p>
+        </w:tc>
+        <w:tc>
+          <w:tcPr>
+            <w:tcW w:type="dxa" w:w="2880"/>
+          </w:tcPr>
+          <w:p>
+            <w:r>
+              <w:t>CRM: new customers from organic. First-touch as baseline</w:t>
+            </w:r>
+          </w:p>
+        </w:tc>
+        <w:tc>
+          <w:tcPr>
+            <w:tcW w:type="dxa" w:w="2880"/>
+          </w:tcPr>
+          <w:p>
+            <w:r>
+              <w:t>CFO Mode</w:t>
+            </w:r>
+          </w:p>
+        </w:tc>
+      </w:tr>
+      <w:tr>
+        <w:tc>
+          <w:tcPr>
+            <w:tcW w:type="dxa" w:w="2880"/>
+          </w:tcPr>
+          <w:p>
+            <w:r>
+              <w:t>Avg revenue per customer ($)</w:t>
+            </w:r>
+          </w:p>
+        </w:tc>
+        <w:tc>
+          <w:tcPr>
+            <w:tcW w:type="dxa" w:w="2880"/>
+          </w:tcPr>
+          <w:p>
+            <w:r>
+              <w:t>Revenue ÷ customers. Enterprise B2B: $50K to $500K+</w:t>
+            </w:r>
+          </w:p>
+        </w:tc>
+        <w:tc>
+          <w:tcPr>
+            <w:tcW w:type="dxa" w:w="2880"/>
+          </w:tcPr>
+          <w:p>
+            <w:r>
+              <w:t>CFO Mode</w:t>
+            </w:r>
+          </w:p>
+        </w:tc>
+      </w:tr>
+      <w:tr>
+        <w:tc>
+          <w:tcPr>
+            <w:tcW w:type="dxa" w:w="2880"/>
+          </w:tcPr>
+          <w:p>
+            <w:r>
+              <w:t>Annual churn rate (%)</w:t>
+            </w:r>
+          </w:p>
+        </w:tc>
+        <w:tc>
+          <w:tcPr>
+            <w:tcW w:type="dxa" w:w="2880"/>
+          </w:tcPr>
+          <w:p>
+            <w:r>
+              <w:t>(Start ARR − End ARR − New ARR) ÷ Start ARR</w:t>
+            </w:r>
+          </w:p>
+        </w:tc>
+        <w:tc>
+          <w:tcPr>
+            <w:tcW w:type="dxa" w:w="2880"/>
+          </w:tcPr>
+          <w:p>
+            <w:r>
+              <w:t>CFO Mode</w:t>
+            </w:r>
+          </w:p>
+        </w:tc>
+      </w:tr>
+      <w:tr>
+        <w:tc>
+          <w:tcPr>
+            <w:tcW w:type="dxa" w:w="2880"/>
+          </w:tcPr>
+          <w:p>
+            <w:r>
+              <w:t>Gross margin (%)</w:t>
+            </w:r>
+          </w:p>
+        </w:tc>
+        <w:tc>
+          <w:tcPr>
+            <w:tcW w:type="dxa" w:w="2880"/>
+          </w:tcPr>
+          <w:p>
+            <w:r>
+              <w:t>SaaS 70-85% / E-com 40-60% / B2B services 50-70%</w:t>
+            </w:r>
+          </w:p>
+        </w:tc>
+        <w:tc>
+          <w:tcPr>
+            <w:tcW w:type="dxa" w:w="2880"/>
+          </w:tcPr>
+          <w:p>
+            <w:r>
+              <w:t>CFO Mode</w:t>
+            </w:r>
+          </w:p>
+        </w:tc>
+      </w:tr>
+      <w:tr>
+        <w:tc>
+          <w:tcPr>
+            <w:tcW w:type="dxa" w:w="2880"/>
+          </w:tcPr>
+          <w:p>
+            <w:r>
+              <w:t>Discount rate (%)</w:t>
+            </w:r>
+          </w:p>
+        </w:tc>
+        <w:tc>
+          <w:tcPr>
+            <w:tcW w:type="dxa" w:w="2880"/>
+          </w:tcPr>
+          <w:p>
+            <w:r>
+              <w:t>Time value of money. Enterprise standard 8 to 12%</w:t>
+            </w:r>
+          </w:p>
+        </w:tc>
+        <w:tc>
+          <w:tcPr>
+            <w:tcW w:type="dxa" w:w="2880"/>
+          </w:tcPr>
+          <w:p>
+            <w:r>
+              <w:t>CFO Mode</w:t>
+            </w:r>
+          </w:p>
+        </w:tc>
+      </w:tr>
+    </w:tbl>
+    <w:p/>
+    <w:p>
+      <w:pPr>
+        <w:pStyle w:val="Heading3"/>
+      </w:pPr>
+      <w:r>
+        <w:rPr>
+          <w:color w:val="1A1612"/>
+        </w:rPr>
+        <w:t>Step 4: Read results in context</w:t>
+      </w:r>
+    </w:p>
+    <w:p>
+      <w:pPr>
+        <w:spacing w:after="120"/>
+      </w:pPr>
+      <w:r>
+        <w:t>No ROI number means much on its own. Always show it next to:</w:t>
+      </w:r>
+    </w:p>
+    <w:p>
+      <w:pPr>
+        <w:pStyle w:val="ListBullet"/>
+        <w:spacing w:after="60"/>
+      </w:pPr>
+      <w:r>
+        <w:t>The time frame it covers, stated clearly.</w:t>
+      </w:r>
+    </w:p>
+    <w:p>
+      <w:pPr>
+        <w:pStyle w:val="ListBullet"/>
+        <w:spacing w:after="60"/>
+      </w:pPr>
+      <w:r>
+        <w:t>The attribution model you used (first-touch, last-touch, or data-driven in GA4).</w:t>
+      </w:r>
+    </w:p>
+    <w:p>
+      <w:pPr>
+        <w:pStyle w:val="ListBullet"/>
+        <w:spacing w:after="60"/>
+      </w:pPr>
+      <w:r>
+        <w:t>Where you are in the ramp. SEO usually shows lower ROI in months 1 to 6 and compounds from month 12.</w:t>
+      </w:r>
+    </w:p>
+    <w:p>
+      <w:pPr>
+        <w:pStyle w:val="ListBullet"/>
+        <w:spacing w:after="60"/>
+      </w:pPr>
+      <w:r>
+        <w:t>A benchmark to compare against, like your paid search or social CAC, so SEO is judged against the alternatives.</w:t>
+      </w:r>
+    </w:p>
+    <w:p>
+      <w:pPr>
+        <w:pStyle w:val="Heading2"/>
+      </w:pPr>
+      <w:r>
+        <w:rPr>
+          <w:color w:val="1A1612"/>
+        </w:rPr>
+        <w:t>Complete formula reference</w:t>
+      </w:r>
+    </w:p>
+    <w:p>
+      <w:pPr>
+        <w:spacing w:after="120"/>
+      </w:pPr>
+      <w:r>
+        <w:t>Every number the tool produces comes from one of these. Nothing is hidden.</w:t>
       </w:r>
     </w:p>
     <w:tbl>
@@ -142,7 +1732,7 @@
               <w:rPr>
                 <w:b/>
               </w:rPr>
-              <w:t>Term</w:t>
+              <w:t>Metric</w:t>
             </w:r>
           </w:p>
         </w:tc>
@@ -155,7 +1745,7 @@
               <w:rPr>
                 <w:b/>
               </w:rPr>
-              <w:t>Where it is placed</w:t>
+              <w:t>Formula</w:t>
             </w:r>
           </w:p>
         </w:tc>
@@ -167,7 +1757,7 @@
           </w:tcPr>
           <w:p>
             <w:r>
-              <w:t>enterprise SEO ROI calculator (primary)</w:t>
+              <w:t>Monthly revenue</w:t>
             </w:r>
           </w:p>
         </w:tc>
@@ -177,7 +1767,7 @@
           </w:tcPr>
           <w:p>
             <w:r>
-              <w:t>Title tag, H1, first sentence (within first 100 words), one H2, meta description, closing CTA</w:t>
+              <w:t>Organic traffic x (Conversion rate ÷ 100) x Avg order value</w:t>
             </w:r>
           </w:p>
         </w:tc>
@@ -189,7 +1779,7 @@
           </w:tcPr>
           <w:p>
             <w:r>
-              <w:t>SEO ROI calculator</w:t>
+              <w:t>Campaign revenue</w:t>
             </w:r>
           </w:p>
         </w:tc>
@@ -199,7 +1789,7 @@
           </w:tcPr>
           <w:p>
             <w:r>
-              <w:t>Intro, one subhead, FAQ</w:t>
+              <w:t>Monthly revenue x Campaign duration</w:t>
             </w:r>
           </w:p>
         </w:tc>
@@ -211,7 +1801,7 @@
           </w:tcPr>
           <w:p>
             <w:r>
-              <w:t>SEO ROI / return on SEO</w:t>
+              <w:t>Campaign investment</w:t>
             </w:r>
           </w:p>
         </w:tc>
@@ -221,7 +1811,7 @@
           </w:tcPr>
           <w:p>
             <w:r>
-              <w:t>Body throughout as the natural synonym, one H2, FAQ</w:t>
+              <w:t>Monthly SEO investment x Campaign duration</w:t>
             </w:r>
           </w:p>
         </w:tc>
@@ -233,7 +1823,7 @@
           </w:tcPr>
           <w:p>
             <w:r>
-              <w:t>SEO ROI formula / how SEO ROI is calculated</w:t>
+              <w:t>Net return</w:t>
             </w:r>
           </w:p>
         </w:tc>
@@ -243,7 +1833,7 @@
           </w:tcPr>
           <w:p>
             <w:r>
-              <w:t>Methodology H2 and FAQ question</w:t>
+              <w:t>Campaign revenue − Campaign investment</w:t>
             </w:r>
           </w:p>
         </w:tc>
@@ -255,7 +1845,7 @@
           </w:tcPr>
           <w:p>
             <w:r>
-              <w:t>organic traffic, conversion rate, average order value</w:t>
+              <w:t>ROI %</w:t>
             </w:r>
           </w:p>
         </w:tc>
@@ -265,7 +1855,7 @@
           </w:tcPr>
           <w:p>
             <w:r>
-              <w:t>Inputs section (first lines), worked example</w:t>
+              <w:t>(Net return ÷ Campaign investment) x 100</w:t>
             </w:r>
           </w:p>
         </w:tc>
@@ -277,7 +1867,7 @@
           </w:tcPr>
           <w:p>
             <w:r>
-              <w:t>SEO investment / SEO spend / marketing budget</w:t>
+              <w:t>Return multiple</w:t>
             </w:r>
           </w:p>
         </w:tc>
@@ -287,7 +1877,7 @@
           </w:tcPr>
           <w:p>
             <w:r>
-              <w:t>Inputs section, CFO section, CTA</w:t>
+              <w:t>Campaign revenue ÷ Campaign investment</w:t>
             </w:r>
           </w:p>
         </w:tc>
@@ -299,7 +1889,7 @@
           </w:tcPr>
           <w:p>
             <w:r>
-              <w:t>customer lifetime value (LTV), CAC, LTV:CAC ratio</w:t>
+              <w:t>Retention period</w:t>
             </w:r>
           </w:p>
         </w:tc>
@@ -309,7 +1899,7 @@
           </w:tcPr>
           <w:p>
             <w:r>
-              <w:t>CFO Mode H2 and H3s, worked example, FAQ</w:t>
+              <w:t>1 ÷ Annual churn rate</w:t>
             </w:r>
           </w:p>
         </w:tc>
@@ -321,7 +1911,7 @@
           </w:tcPr>
           <w:p>
             <w:r>
-              <w:t>NPV / present value / time value of money</w:t>
+              <w:t>Customer LTV</w:t>
             </w:r>
           </w:p>
         </w:tc>
@@ -331,7 +1921,7 @@
           </w:tcPr>
           <w:p>
             <w:r>
-              <w:t>CFO Mode section, methodology</w:t>
+              <w:t>ARPC x Retention period x (Gross margin ÷ 100)</w:t>
             </w:r>
           </w:p>
         </w:tc>
@@ -343,7 +1933,7 @@
           </w:tcPr>
           <w:p>
             <w:r>
-              <w:t>churn rate, gross margin, discount rate</w:t>
+              <w:t>NPV of LTV</w:t>
             </w:r>
           </w:p>
         </w:tc>
@@ -353,7 +1943,7 @@
           </w:tcPr>
           <w:p>
             <w:r>
-              <w:t>CFO inputs explainer</w:t>
+              <w:t>LTV ÷ (1 + Discount rate)</w:t>
             </w:r>
           </w:p>
         </w:tc>
@@ -365,7 +1955,7 @@
           </w:tcPr>
           <w:p>
             <w:r>
-              <w:t>good SEO ROI / SEO ROI benchmark</w:t>
+              <w:t>SEO CAC</w:t>
             </w:r>
           </w:p>
         </w:tc>
@@ -375,7 +1965,7 @@
           </w:tcPr>
           <w:p>
             <w:r>
-              <w:t>Benchmarks H2, FAQ</w:t>
+              <w:t>Total SEO costs ÷ Customers acquired</w:t>
             </w:r>
           </w:p>
         </w:tc>
@@ -387,7 +1977,7 @@
           </w:tcPr>
           <w:p>
             <w:r>
-              <w:t>how long does SEO take</w:t>
+              <w:t>LTV:CAC</w:t>
             </w:r>
           </w:p>
         </w:tc>
@@ -397,7 +1987,7 @@
           </w:tcPr>
           <w:p>
             <w:r>
-              <w:t>Timeline H2, FAQ</w:t>
+              <w:t>LTV ÷ CAC  (target 3:1 / strong 5:1 / exceptional 10:1)</w:t>
             </w:r>
           </w:p>
         </w:tc>
@@ -409,7 +1999,7 @@
           </w:tcPr>
           <w:p>
             <w:r>
-              <w:t>organic search revenue</w:t>
+              <w:t>ROI % (CFO)</w:t>
             </w:r>
           </w:p>
         </w:tc>
@@ -419,23 +2009,218 @@
           </w:tcPr>
           <w:p>
             <w:r>
-              <w:t>Intro, results section</w:t>
+              <w:t>((NPV of LTV − CAC) ÷ CAC) x 100</w:t>
             </w:r>
           </w:p>
         </w:tc>
       </w:tr>
     </w:tbl>
+    <w:p/>
     <w:p>
       <w:pPr>
-        <w:spacing w:after="120"/>
-      </w:pPr>
+        <w:pStyle w:val="Heading2"/>
+      </w:pPr>
+      <w:r>
+        <w:rPr>
+          <w:color w:val="1A1612"/>
+        </w:rPr>
+        <w:t>What counts as a good SEO ROI</w:t>
+      </w:r>
     </w:p>
     <w:p>
       <w:pPr>
         <w:spacing w:after="120"/>
       </w:pPr>
       <w:r>
-        <w:t>Internal links (anchor context to destination). Swap destinations for your real URLs.</w:t>
+        <w:t>It depends on your industry, your competition, and how long you have been at it, so treat any benchmark as an estimate, not a promise.</w:t>
+      </w:r>
+    </w:p>
+    <w:p>
+      <w:pPr>
+        <w:pStyle w:val="ListBullet"/>
+        <w:spacing w:after="60"/>
+      </w:pPr>
+      <w:r>
+        <w:t>For Quick ROI, a 300% to 500% return is strong in years 2 to 3 of a mature program. Year 1 is usually lower, and a 12-month ROI of 100% to 200% is healthy for a new enterprise program.</w:t>
+      </w:r>
+    </w:p>
+    <w:p>
+      <w:pPr>
+        <w:pStyle w:val="ListBullet"/>
+        <w:spacing w:after="60"/>
+      </w:pPr>
+      <w:r>
+        <w:t>For CFO Mode, an LTV:CAC of 3:1 is the floor for a healthy channel. 5:1 is strong. 10:1 is exceptional.</w:t>
+      </w:r>
+    </w:p>
+    <w:p>
+      <w:pPr>
+        <w:pStyle w:val="ListBullet"/>
+        <w:spacing w:after="60"/>
+      </w:pPr>
+      <w:r>
+        <w:t>A ratio far above 10:1 is not always good news. It often means you are underinvesting and leaving growth on the table.</w:t>
+      </w:r>
+    </w:p>
+    <w:p>
+      <w:r>
+        <w:t xml:space="preserve">Want to see what this looks like for a live program? Our </w:t>
+      </w:r>
+      <w:r>
+        <w:rPr>
+          <w:color w:val="5A43D6"/>
+          <w:u w:val="single"/>
+        </w:rPr>
+        <w:t>SEO case studies</w:t>
+      </w:r>
+      <w:r>
+        <w:t xml:space="preserve"> (https://goldflexmarketing.com/case-studies/) show the inputs and the outcomes for real enterprise campaigns.</w:t>
+      </w:r>
+    </w:p>
+    <w:p>
+      <w:pPr>
+        <w:pStyle w:val="Heading2"/>
+      </w:pPr>
+      <w:r>
+        <w:rPr>
+          <w:color w:val="1A1612"/>
+        </w:rPr>
+        <w:t>How long before SEO pays back</w:t>
+      </w:r>
+    </w:p>
+    <w:p>
+      <w:pPr>
+        <w:spacing w:after="120"/>
+      </w:pPr>
+      <w:r>
+        <w:t>SEO is a compounding investment, not a switch. Most programs reach a positive return in the 6 to 12 month range, with the strongest results often in year two or three.</w:t>
+      </w:r>
+    </w:p>
+    <w:p>
+      <w:pPr>
+        <w:spacing w:after="120"/>
+      </w:pPr>
+      <w:r>
+        <w:t>You will see leading signs sooner. Impressions and rankings move first, qualified traffic follows, and revenue is the lagging indicator that trails traffic by a couple of months. When you model a campaign here, a 12-month or longer duration gives a fairer picture than a 3-month window, because the early months carry cost before the revenue catches up.</w:t>
+      </w:r>
+    </w:p>
+    <w:p>
+      <w:pPr>
+        <w:pStyle w:val="Heading2"/>
+      </w:pPr>
+      <w:r>
+        <w:rPr>
+          <w:color w:val="1A1612"/>
+        </w:rPr>
+        <w:t>Why enterprise SEO ROI is measured differently</w:t>
+      </w:r>
+    </w:p>
+    <w:p>
+      <w:pPr>
+        <w:pStyle w:val="Heading3"/>
+      </w:pPr>
+      <w:r>
+        <w:rPr>
+          <w:color w:val="1A1612"/>
+        </w:rPr>
+        <w:t>Scale changes the math</w:t>
+      </w:r>
+    </w:p>
+    <w:p>
+      <w:pPr>
+        <w:spacing w:after="120"/>
+      </w:pPr>
+      <w:r>
+        <w:t>Enterprise SEO works across thousands of pages, several product lines, and competitive keywords with strong buying intent. A 1% lift in conversion rate on a site doing 200,000 visitors a month is worth eight times the same lift at 25,000 visitors. Stretch that over a 12-month campaign and the revenue at stake gets large fast.</w:t>
+      </w:r>
+    </w:p>
+    <w:p>
+      <w:pPr>
+        <w:pStyle w:val="Heading3"/>
+      </w:pPr>
+      <w:r>
+        <w:rPr>
+          <w:color w:val="1A1612"/>
+        </w:rPr>
+        <w:t>It is a compounding asset</w:t>
+      </w:r>
+    </w:p>
+    <w:p>
+      <w:pPr>
+        <w:spacing w:after="120"/>
+      </w:pPr>
+      <w:r>
+        <w:t>With paid ads, traffic stops the day the budget stops. SEO builds an asset that keeps working. Each optimized page, each quality backlink, and each technical fix adds lasting value to your domain. So the return on SEO tends to improve every year at the same spend. Paid search cannot make that claim, since its ROI stays roughly flat as you scale. CFO Mode shows this through LTV: as authority grows, the LTV:CAC ratio widens without spending more.</w:t>
+      </w:r>
+    </w:p>
+    <w:p>
+      <w:pPr>
+        <w:pStyle w:val="Heading3"/>
+      </w:pPr>
+      <w:r>
+        <w:rPr>
+          <w:color w:val="1A1612"/>
+        </w:rPr>
+        <w:t>Attribution takes care</w:t>
+      </w:r>
+    </w:p>
+    <w:p>
+      <w:pPr>
+        <w:spacing w:after="120"/>
+      </w:pPr>
+      <w:r>
+        <w:t>Enterprise B2B buyers rarely convert on their first organic visit. A typical journey runs 8 to 12 touchpoints over 60 to 180 days. Giving organic search fair credit needs clear, consistent rules.</w:t>
+      </w:r>
+    </w:p>
+    <w:tbl>
+      <w:tblPr>
+        <w:tblStyle w:val="LightShading-Accent1"/>
+        <w:tblW w:type="auto" w:w="0"/>
+        <w:tblLook w:firstColumn="1" w:firstRow="1" w:lastColumn="0" w:lastRow="0" w:noHBand="0" w:noVBand="1" w:val="04A0"/>
+      </w:tblPr>
+      <w:tblGrid>
+        <w:gridCol w:w="8640"/>
+      </w:tblGrid>
+      <w:tr>
+        <w:tc>
+          <w:tcPr>
+            <w:tcW w:type="dxa" w:w="8640"/>
+          </w:tcPr>
+          <w:p>
+            <w:r>
+              <w:rPr>
+                <w:b/>
+                <w:color w:val="B88600"/>
+              </w:rPr>
+              <w:t>Attribution recommendation</w:t>
+            </w:r>
+          </w:p>
+          <w:p>
+            <w:r>
+              <w:t>For a budget case with your CFO, use first-touch organic attribution, since it credits SEO for the deals it started. For ongoing reporting, use GA4 data-driven attribution. The truth sits between the two, and showing both signals that you have done the work.</w:t>
+            </w:r>
+          </w:p>
+        </w:tc>
+      </w:tr>
+    </w:tbl>
+    <w:p/>
+    <w:p>
+      <w:pPr>
+        <w:pStyle w:val="Heading2"/>
+      </w:pPr>
+      <w:r>
+        <w:rPr>
+          <w:color w:val="1A1612"/>
+        </w:rPr>
+        <w:t>Who it is for</w:t>
+      </w:r>
+    </w:p>
+    <w:p>
+      <w:pPr>
+        <w:spacing w:after="120"/>
+      </w:pPr>
+      <w:r>
+        <w:t>Both modes map to the conversations each role actually has. In short:</w:t>
       </w:r>
     </w:p>
     <w:tbl>
@@ -458,7 +2243,7 @@
               <w:rPr>
                 <w:b/>
               </w:rPr>
-              <w:t>Anchor context</w:t>
+              <w:t>Your role</w:t>
             </w:r>
           </w:p>
         </w:tc>
@@ -471,7 +2256,7 @@
               <w:rPr>
                 <w:b/>
               </w:rPr>
-              <w:t>Suggested destination</w:t>
+              <w:t>How to use it</w:t>
             </w:r>
           </w:p>
         </w:tc>
@@ -483,7 +2268,7 @@
           </w:tcPr>
           <w:p>
             <w:r>
-              <w:t>"enterprise SEO services" (intro and CTA)</w:t>
+              <w:t>CMO / VP Marketing</w:t>
             </w:r>
           </w:p>
         </w:tc>
@@ -493,7 +2278,7 @@
           </w:tcPr>
           <w:p>
             <w:r>
-              <w:t>https://goldflexmarketing.com/enterprise-seo/</w:t>
+              <w:t>CFO Mode for the board case (LTV:CAC and NPV-adjusted ROI). Quick ROI at 12 or 24 months to talk total program value, not monthly cost.</w:t>
             </w:r>
           </w:p>
         </w:tc>
@@ -505,7 +2290,7 @@
           </w:tcPr>
           <w:p>
             <w:r>
-              <w:t>"book a strategy call" / "talk to our team" (CTA)</w:t>
+              <w:t>SEO director / manager</w:t>
             </w:r>
           </w:p>
         </w:tc>
@@ -515,7 +2300,7 @@
           </w:tcPr>
           <w:p>
             <w:r>
-              <w:t>https://goldflexmarketing.com/contact/</w:t>
+              <w:t>Quick ROI for monthly and quarterly reporting. CFO Mode for annual planning and headcount cases.</w:t>
             </w:r>
           </w:p>
         </w:tc>
@@ -527,7 +2312,7 @@
           </w:tcPr>
           <w:p>
             <w:r>
-              <w:t>"our SEO case studies" (benchmarks)</w:t>
+              <w:t>CEO / business owner</w:t>
             </w:r>
           </w:p>
         </w:tc>
@@ -537,7 +2322,7 @@
           </w:tcPr>
           <w:p>
             <w:r>
-              <w:t>https://goldflexmarketing.com/case-studies/</w:t>
+              <w:t>CFO Mode to check whether SEO spend is the right size. Above 5:1, invest more. Below 3:1, fix retention or conversion first.</w:t>
             </w:r>
           </w:p>
         </w:tc>
@@ -549,7 +2334,7 @@
           </w:tcPr>
           <w:p>
             <w:r>
-              <w:t>"SEO services" (FAQ on cost)</w:t>
+              <w:t>Agency / consultant</w:t>
             </w:r>
           </w:p>
         </w:tc>
@@ -559,161 +2344,82 @@
           </w:tcPr>
           <w:p>
             <w:r>
-              <w:t>https://goldflexmarketing.com/seo-services/</w:t>
+              <w:t>Quick ROI to show a prospect the return over their exact contract term. CFO Mode to justify a growing retainer.</w:t>
+            </w:r>
+          </w:p>
+        </w:tc>
+      </w:tr>
+      <w:tr>
+        <w:tc>
+          <w:tcPr>
+            <w:tcW w:type="dxa" w:w="4320"/>
+          </w:tcPr>
+          <w:p>
+            <w:r>
+              <w:t>CFO / finance</w:t>
+            </w:r>
+          </w:p>
+        </w:tc>
+        <w:tc>
+          <w:tcPr>
+            <w:tcW w:type="dxa" w:w="4320"/>
+          </w:tcPr>
+          <w:p>
+            <w:r>
+              <w:t>CFO Mode was built for you. NPV of LTV answers the time-value objection; LTV:CAC frames SEO as a capital decision.</w:t>
             </w:r>
           </w:p>
         </w:tc>
       </w:tr>
     </w:tbl>
+    <w:p/>
     <w:p>
+      <w:pPr>
+        <w:pStyle w:val="Heading2"/>
+      </w:pPr>
       <w:r>
-        <w:br w:type="page"/>
+        <w:rPr>
+          <w:color w:val="1A1612"/>
+        </w:rPr>
+        <w:t>Methodology and assumptions</w:t>
       </w:r>
     </w:p>
     <w:p>
       <w:pPr>
-        <w:pStyle w:val="Heading1"/>
+        <w:spacing w:after="120"/>
       </w:pPr>
       <w:r>
-        <w:rPr>
-          <w:color w:val="B88600"/>
-        </w:rPr>
-        <w:t>Part 3 — Page content (copy-paste ready)</w:t>
+        <w:t>The formulas use standard financial modeling adapted for marketing. Worth disclosing when you present:</w:t>
       </w:r>
     </w:p>
     <w:p>
+      <w:pPr>
+        <w:pStyle w:val="ListBullet"/>
+        <w:spacing w:after="60"/>
+      </w:pPr>
       <w:r>
         <w:rPr>
           <w:b/>
         </w:rPr>
-        <w:t xml:space="preserve">Title tag: </w:t>
+        <w:t>Steady monthly performance.</w:t>
       </w:r>
       <w:r>
-        <w:t xml:space="preserve">Enterprise SEO ROI Calculator | Goldflex Marketing  </w:t>
-      </w:r>
-      <w:r>
-        <w:rPr>
-          <w:i/>
-        </w:rPr>
-        <w:t>(54 characters)</w:t>
+        <w:t xml:space="preserve"> Quick ROI assumes the same monthly result across the whole duration. Real programs ramp: lower in months 1 to 4, faster from month 5 as content indexes and links build. For a conservative view, model the first six months at half the expected traffic.</w:t>
       </w:r>
     </w:p>
     <w:p>
+      <w:pPr>
+        <w:pStyle w:val="ListBullet"/>
+        <w:spacing w:after="60"/>
+      </w:pPr>
       <w:r>
         <w:rPr>
           <w:b/>
         </w:rPr>
-        <w:t xml:space="preserve">Meta description: </w:t>
+        <w:t>Full attribution.</w:t>
       </w:r>
       <w:r>
-        <w:t xml:space="preserve">Free enterprise SEO ROI calculator. Enter your traffic, conversions, and spend to see projected revenue, ROI, LTV:CAC, and payback in seconds.  </w:t>
-      </w:r>
-      <w:r>
-        <w:rPr>
-          <w:i/>
-        </w:rPr>
-        <w:t>(148 characters)</w:t>
-      </w:r>
-    </w:p>
-    <w:p/>
-    <w:p>
-      <w:pPr>
-        <w:pStyle w:val="Heading1"/>
-      </w:pPr>
-      <w:r>
-        <w:rPr>
-          <w:color w:val="B88600"/>
-        </w:rPr>
-        <w:t>Enterprise SEO ROI Calculator</w:t>
-      </w:r>
-    </w:p>
-    <w:p>
-      <w:pPr>
-        <w:spacing w:after="120"/>
-      </w:pPr>
-      <w:r>
-        <w:t>Use this enterprise SEO ROI calculator to turn your traffic, conversions, and budget into a clear revenue and return picture. Enter a few numbers you already track, and you will see your projected organic search revenue, your net return, and your ROI as a percentage. There is no signup, and you can export the whole thing as a branded PDF to share with your team or your CFO.</w:t>
-      </w:r>
-    </w:p>
-    <w:p>
-      <w:pPr>
-        <w:spacing w:after="120"/>
-      </w:pPr>
-      <w:r>
-        <w:t>It is built for marketing leaders who need to defend an SEO budget, not just run one. You do not need to be technical to read it. If you can read a P&amp;L, you can read this.</w:t>
-      </w:r>
-    </w:p>
-    <w:p>
-      <w:pPr>
-        <w:pStyle w:val="Heading2"/>
-      </w:pPr>
-      <w:r>
-        <w:rPr>
-          <w:color w:val="1A1612"/>
-        </w:rPr>
-        <w:t>What this calculator does</w:t>
-      </w:r>
-    </w:p>
-    <w:p>
-      <w:pPr>
-        <w:spacing w:after="120"/>
-      </w:pPr>
-      <w:r>
-        <w:t>Think of it as two calculators in one.</w:t>
-      </w:r>
-    </w:p>
-    <w:p>
-      <w:pPr>
-        <w:spacing w:after="120"/>
-      </w:pPr>
-      <w:r>
-        <w:t>The first mode gives you a fast revenue and ROI snapshot. The second translates SEO into the exact metrics a finance team uses to judge any investment: customer lifetime value, acquisition cost, and the present value of that customer. You pick the mode that fits the conversation you are about to have.</w:t>
-      </w:r>
-    </w:p>
-    <w:p>
-      <w:pPr>
-        <w:spacing w:after="120"/>
-      </w:pPr>
-      <w:r>
-        <w:t>Both modes work off numbers you can pull from Google Search Console, GA4, or your CRM. Both show their math, so nothing is a black box.</w:t>
-      </w:r>
-    </w:p>
-    <w:p>
-      <w:pPr>
-        <w:pStyle w:val="Heading2"/>
-      </w:pPr>
-      <w:r>
-        <w:rPr>
-          <w:color w:val="1A1612"/>
-        </w:rPr>
-        <w:t>How to use it</w:t>
-      </w:r>
-    </w:p>
-    <w:p>
-      <w:pPr>
-        <w:spacing w:after="120"/>
-      </w:pPr>
-      <w:r>
-        <w:t>Pick a mode at the top, fill in the fields, and the results update as you type. Here is what each input means.</w:t>
-      </w:r>
-    </w:p>
-    <w:p>
-      <w:pPr>
-        <w:pStyle w:val="Heading3"/>
-      </w:pPr>
-      <w:r>
-        <w:rPr>
-          <w:color w:val="1A1612"/>
-        </w:rPr>
-        <w:t>Quick ROI mode (the fast snapshot)</w:t>
-      </w:r>
-    </w:p>
-    <w:p>
-      <w:pPr>
-        <w:spacing w:after="120"/>
-      </w:pPr>
-      <w:r>
-        <w:t>This is the mode for a quick gut-check or a slide in tomorrow’s deck. Five inputs:</w:t>
+        <w:t xml:space="preserve"> The numbers assume 100% credit to organic search. Apply your real multi-touch weighting before you show finance a final figure.</w:t>
       </w:r>
     </w:p>
     <w:p>
@@ -725,10 +2431,10 @@
         <w:rPr>
           <w:b/>
         </w:rPr>
-        <w:t>Monthly organic traffic.</w:t>
+        <w:t>LTV model.</w:t>
       </w:r>
       <w:r>
-        <w:t xml:space="preserve"> Visitors who reach your site from organic search each month. Find it in Search Console or GA4.</w:t>
+        <w:t xml:space="preserve"> CFO Mode uses a retention model of 1 divided by churn, standard for SaaS and subscriptions. It can overstate LTV in high-churn businesses. For e-commerce, a cohort-based LTV from your analytics will be closer.</w:t>
       </w:r>
     </w:p>
     <w:p>
@@ -740,10 +2446,10 @@
         <w:rPr>
           <w:b/>
         </w:rPr>
-        <w:t>Conversion rate.</w:t>
+        <w:t>Flat discount rate.</w:t>
       </w:r>
       <w:r>
-        <w:t xml:space="preserve"> The share of those visitors who become a customer or lead. For most enterprise sites this sits between 1% and 3%.</w:t>
+        <w:t xml:space="preserve"> A single annual rate is applied. For board-level precision, use your own WACC or hurdle rate.</w:t>
       </w:r>
     </w:p>
     <w:p>
@@ -755,1005 +2461,10 @@
         <w:rPr>
           <w:b/>
         </w:rPr>
-        <w:t>Average order or deal value.</w:t>
+        <w:t>Gross margin, not net.</w:t>
       </w:r>
       <w:r>
-        <w:t xml:space="preserve"> Your average revenue per conversion. Use deal size for B2B, average cart value for e-commerce.</w:t>
-      </w:r>
-    </w:p>
-    <w:p>
-      <w:pPr>
-        <w:pStyle w:val="ListBullet"/>
-        <w:spacing w:after="60"/>
-      </w:pPr>
-      <w:r>
-        <w:rPr>
-          <w:b/>
-        </w:rPr>
-        <w:t>Monthly SEO investment.</w:t>
-      </w:r>
-      <w:r>
-        <w:t xml:space="preserve"> Your all-in cost: agency fees, tools, content, dev hours, and internal team time.</w:t>
-      </w:r>
-    </w:p>
-    <w:p>
-      <w:pPr>
-        <w:pStyle w:val="ListBullet"/>
-        <w:spacing w:after="60"/>
-      </w:pPr>
-      <w:r>
-        <w:rPr>
-          <w:b/>
-        </w:rPr>
-        <w:t>Campaign duration.</w:t>
-      </w:r>
-      <w:r>
-        <w:t xml:space="preserve"> How many months you want to model, from 1 to 36. Most teams run the numbers at 6, 12, 18, or 24 months.</w:t>
-      </w:r>
-    </w:p>
-    <w:p>
-      <w:pPr>
-        <w:spacing w:after="120"/>
-      </w:pPr>
-      <w:r>
-        <w:t>Pick this mode when you want a revenue-and-return headline fast, and when a single average deal value describes your business well enough.</w:t>
-      </w:r>
-    </w:p>
-    <w:p>
-      <w:pPr>
-        <w:pStyle w:val="Heading3"/>
-      </w:pPr>
-      <w:r>
-        <w:rPr>
-          <w:color w:val="1A1612"/>
-        </w:rPr>
-        <w:t>CFO mode (LTV, CAC, NPV)</w:t>
-      </w:r>
-    </w:p>
-    <w:p>
-      <w:pPr>
-        <w:spacing w:after="120"/>
-      </w:pPr>
-      <w:r>
-        <w:t>This is the mode for the budget meeting. It uses the framework finance teams and investors already trust, so SEO gets judged on the same terms as every other line item. Six inputs:</w:t>
-      </w:r>
-    </w:p>
-    <w:p>
-      <w:pPr>
-        <w:pStyle w:val="ListBullet"/>
-        <w:spacing w:after="60"/>
-      </w:pPr>
-      <w:r>
-        <w:rPr>
-          <w:b/>
-        </w:rPr>
-        <w:t>Total SEO costs.</w:t>
-      </w:r>
-      <w:r>
-        <w:t xml:space="preserve"> Your full annual spend on SEO, all in.</w:t>
-      </w:r>
-    </w:p>
-    <w:p>
-      <w:pPr>
-        <w:pStyle w:val="ListBullet"/>
-        <w:spacing w:after="60"/>
-      </w:pPr>
-      <w:r>
-        <w:rPr>
-          <w:b/>
-        </w:rPr>
-        <w:t>Customers acquired.</w:t>
-      </w:r>
-      <w:r>
-        <w:t xml:space="preserve"> New customers you can attribute to organic search, ideally from CRM attribution.</w:t>
-      </w:r>
-    </w:p>
-    <w:p>
-      <w:pPr>
-        <w:pStyle w:val="ListBullet"/>
-        <w:spacing w:after="60"/>
-      </w:pPr>
-      <w:r>
-        <w:rPr>
-          <w:b/>
-        </w:rPr>
-        <w:t>Average revenue per customer.</w:t>
-      </w:r>
-      <w:r>
-        <w:t xml:space="preserve"> Annual revenue per customer. For enterprise B2B this can run from tens of thousands into the hundreds of thousands.</w:t>
-      </w:r>
-    </w:p>
-    <w:p>
-      <w:pPr>
-        <w:pStyle w:val="ListBullet"/>
-        <w:spacing w:after="60"/>
-      </w:pPr>
-      <w:r>
-        <w:rPr>
-          <w:b/>
-        </w:rPr>
-        <w:t>Annual churn rate.</w:t>
-      </w:r>
-      <w:r>
-        <w:t xml:space="preserve"> The share of customers you lose each year. Lower churn means a longer, more valuable relationship.</w:t>
-      </w:r>
-    </w:p>
-    <w:p>
-      <w:pPr>
-        <w:pStyle w:val="ListBullet"/>
-        <w:spacing w:after="60"/>
-      </w:pPr>
-      <w:r>
-        <w:rPr>
-          <w:b/>
-        </w:rPr>
-        <w:t>Gross margin.</w:t>
-      </w:r>
-      <w:r>
-        <w:t xml:space="preserve"> What you keep after the cost of delivering the product or service.</w:t>
-      </w:r>
-    </w:p>
-    <w:p>
-      <w:pPr>
-        <w:pStyle w:val="ListBullet"/>
-        <w:spacing w:after="60"/>
-      </w:pPr>
-      <w:r>
-        <w:rPr>
-          <w:b/>
-        </w:rPr>
-        <w:t>Discount rate.</w:t>
-      </w:r>
-      <w:r>
-        <w:t xml:space="preserve"> A finance input, usually 8% to 12%, that accounts for the time value of money. A dollar next year is worth a little less than a dollar today, and this adjusts for that.</w:t>
-      </w:r>
-    </w:p>
-    <w:p>
-      <w:pPr>
-        <w:spacing w:after="120"/>
-      </w:pPr>
-      <w:r>
-        <w:t>Pick this mode when you are defending budget to finance, when your customers stick around for years, or when lifetime value tells the real story better than a single sale.</w:t>
-      </w:r>
-    </w:p>
-    <w:p>
-      <w:pPr>
-        <w:pStyle w:val="Heading2"/>
-      </w:pPr>
-      <w:r>
-        <w:rPr>
-          <w:color w:val="1A1612"/>
-        </w:rPr>
-        <w:t>How to read your results</w:t>
-      </w:r>
-    </w:p>
-    <w:p>
-      <w:pPr>
-        <w:pStyle w:val="Heading3"/>
-      </w:pPr>
-      <w:r>
-        <w:rPr>
-          <w:color w:val="1A1612"/>
-        </w:rPr>
-        <w:t>Quick ROI mode</w:t>
-      </w:r>
-    </w:p>
-    <w:p>
-      <w:pPr>
-        <w:spacing w:after="120"/>
-      </w:pPr>
-      <w:r>
-        <w:t>You get six numbers:</w:t>
-      </w:r>
-    </w:p>
-    <w:p>
-      <w:pPr>
-        <w:pStyle w:val="ListBullet"/>
-        <w:spacing w:after="60"/>
-      </w:pPr>
-      <w:r>
-        <w:rPr>
-          <w:b/>
-        </w:rPr>
-        <w:t>Monthly revenue.</w:t>
-      </w:r>
-      <w:r>
-        <w:t xml:space="preserve"> Projected revenue from organic search each month.</w:t>
-      </w:r>
-    </w:p>
-    <w:p>
-      <w:pPr>
-        <w:pStyle w:val="ListBullet"/>
-        <w:spacing w:after="60"/>
-      </w:pPr>
-      <w:r>
-        <w:rPr>
-          <w:b/>
-        </w:rPr>
-        <w:t>Campaign revenue.</w:t>
-      </w:r>
-      <w:r>
-        <w:t xml:space="preserve"> That monthly figure across the full duration you set.</w:t>
-      </w:r>
-    </w:p>
-    <w:p>
-      <w:pPr>
-        <w:pStyle w:val="ListBullet"/>
-        <w:spacing w:after="60"/>
-      </w:pPr>
-      <w:r>
-        <w:rPr>
-          <w:b/>
-        </w:rPr>
-        <w:t>Campaign investment.</w:t>
-      </w:r>
-      <w:r>
-        <w:t xml:space="preserve"> Your total SEO spend over the same period.</w:t>
-      </w:r>
-    </w:p>
-    <w:p>
-      <w:pPr>
-        <w:pStyle w:val="ListBullet"/>
-        <w:spacing w:after="60"/>
-      </w:pPr>
-      <w:r>
-        <w:rPr>
-          <w:b/>
-        </w:rPr>
-        <w:t>Net return.</w:t>
-      </w:r>
-      <w:r>
-        <w:t xml:space="preserve"> Campaign revenue minus campaign investment. The dollars left over.</w:t>
-      </w:r>
-    </w:p>
-    <w:p>
-      <w:pPr>
-        <w:pStyle w:val="ListBullet"/>
-        <w:spacing w:after="60"/>
-      </w:pPr>
-      <w:r>
-        <w:rPr>
-          <w:b/>
-        </w:rPr>
-        <w:t>SEO ROI.</w:t>
-      </w:r>
-      <w:r>
-        <w:t xml:space="preserve"> Your return as a percentage. Positive means you are projected to make more than you spend.</w:t>
-      </w:r>
-    </w:p>
-    <w:p>
-      <w:pPr>
-        <w:pStyle w:val="ListBullet"/>
-        <w:spacing w:after="60"/>
-      </w:pPr>
-      <w:r>
-        <w:rPr>
-          <w:b/>
-        </w:rPr>
-        <w:t>Return multiple.</w:t>
-      </w:r>
-      <w:r>
-        <w:t xml:space="preserve"> Revenue earned per dollar invested. A 5x multiple means $5 back for every $1 in.</w:t>
-      </w:r>
-    </w:p>
-    <w:p>
-      <w:pPr>
-        <w:pStyle w:val="Heading3"/>
-      </w:pPr>
-      <w:r>
-        <w:rPr>
-          <w:color w:val="1A1612"/>
-        </w:rPr>
-        <w:t>CFO mode</w:t>
-      </w:r>
-    </w:p>
-    <w:p>
-      <w:pPr>
-        <w:spacing w:after="120"/>
-      </w:pPr>
-      <w:r>
-        <w:t>You get five headline metrics plus a health score:</w:t>
-      </w:r>
-    </w:p>
-    <w:p>
-      <w:pPr>
-        <w:pStyle w:val="ListBullet"/>
-        <w:spacing w:after="60"/>
-      </w:pPr>
-      <w:r>
-        <w:rPr>
-          <w:b/>
-        </w:rPr>
-        <w:t>Retention period.</w:t>
-      </w:r>
-      <w:r>
-        <w:t xml:space="preserve"> How long an average customer stays, in years.</w:t>
-      </w:r>
-    </w:p>
-    <w:p>
-      <w:pPr>
-        <w:pStyle w:val="ListBullet"/>
-        <w:spacing w:after="60"/>
-      </w:pPr>
-      <w:r>
-        <w:rPr>
-          <w:b/>
-        </w:rPr>
-        <w:t>Customer LTV.</w:t>
-      </w:r>
-      <w:r>
-        <w:t xml:space="preserve"> The margin a customer is worth over that whole relationship.</w:t>
-      </w:r>
-    </w:p>
-    <w:p>
-      <w:pPr>
-        <w:pStyle w:val="ListBullet"/>
-        <w:spacing w:after="60"/>
-      </w:pPr>
-      <w:r>
-        <w:rPr>
-          <w:b/>
-        </w:rPr>
-        <w:t>NPV of LTV.</w:t>
-      </w:r>
-      <w:r>
-        <w:t xml:space="preserve"> That lifetime value adjusted to today’s dollars using your discount rate.</w:t>
-      </w:r>
-    </w:p>
-    <w:p>
-      <w:pPr>
-        <w:pStyle w:val="ListBullet"/>
-        <w:spacing w:after="60"/>
-      </w:pPr>
-      <w:r>
-        <w:rPr>
-          <w:b/>
-        </w:rPr>
-        <w:t>CAC.</w:t>
-      </w:r>
-      <w:r>
-        <w:t xml:space="preserve"> What it costs to acquire one customer through SEO.</w:t>
-      </w:r>
-    </w:p>
-    <w:p>
-      <w:pPr>
-        <w:pStyle w:val="ListBullet"/>
-        <w:spacing w:after="60"/>
-      </w:pPr>
-      <w:r>
-        <w:rPr>
-          <w:b/>
-        </w:rPr>
-        <w:t>SEO ROI.</w:t>
-      </w:r>
-      <w:r>
-        <w:t xml:space="preserve"> The discounted value of a customer measured against what they cost to win.</w:t>
-      </w:r>
-    </w:p>
-    <w:p>
-      <w:pPr>
-        <w:pStyle w:val="ListBullet"/>
-        <w:spacing w:after="60"/>
-      </w:pPr>
-      <w:r>
-        <w:rPr>
-          <w:b/>
-        </w:rPr>
-        <w:t>LTV:CAC health score.</w:t>
-      </w:r>
-      <w:r>
-        <w:t xml:space="preserve"> The ratio of value to cost, with a quick read on whether it is healthy. The common benchmarks: 3:1 is healthy, 5:1 is strong, and 10:1 is exceptional.</w:t>
-      </w:r>
-    </w:p>
-    <w:p>
-      <w:pPr>
-        <w:pStyle w:val="Heading2"/>
-      </w:pPr>
-      <w:r>
-        <w:rPr>
-          <w:color w:val="1A1612"/>
-        </w:rPr>
-        <w:t>A worked example</w:t>
-      </w:r>
-    </w:p>
-    <w:p>
-      <w:pPr>
-        <w:pStyle w:val="Heading3"/>
-      </w:pPr>
-      <w:r>
-        <w:rPr>
-          <w:color w:val="1A1612"/>
-        </w:rPr>
-        <w:t>Quick ROI mode</w:t>
-      </w:r>
-    </w:p>
-    <w:p>
-      <w:pPr>
-        <w:spacing w:after="120"/>
-      </w:pPr>
-      <w:r>
-        <w:t>Say you run these numbers for a 12-month campaign:</w:t>
-      </w:r>
-    </w:p>
-    <w:p>
-      <w:pPr>
-        <w:pStyle w:val="ListBullet"/>
-        <w:spacing w:after="60"/>
-      </w:pPr>
-      <w:r>
-        <w:t>Monthly organic traffic: 20,000</w:t>
-      </w:r>
-    </w:p>
-    <w:p>
-      <w:pPr>
-        <w:pStyle w:val="ListBullet"/>
-        <w:spacing w:after="60"/>
-      </w:pPr>
-      <w:r>
-        <w:t>Conversion rate: 1.5%</w:t>
-      </w:r>
-    </w:p>
-    <w:p>
-      <w:pPr>
-        <w:pStyle w:val="ListBullet"/>
-        <w:spacing w:after="60"/>
-      </w:pPr>
-      <w:r>
-        <w:t>Average order value: $100</w:t>
-      </w:r>
-    </w:p>
-    <w:p>
-      <w:pPr>
-        <w:pStyle w:val="ListBullet"/>
-        <w:spacing w:after="60"/>
-      </w:pPr>
-      <w:r>
-        <w:t>Monthly SEO investment: $6,000</w:t>
-      </w:r>
-    </w:p>
-    <w:p>
-      <w:pPr>
-        <w:spacing w:after="120"/>
-      </w:pPr>
-      <w:r>
-        <w:t>The calculator returns:</w:t>
-      </w:r>
-    </w:p>
-    <w:p>
-      <w:pPr>
-        <w:pStyle w:val="ListBullet"/>
-        <w:spacing w:after="60"/>
-      </w:pPr>
-      <w:r>
-        <w:t xml:space="preserve">Monthly revenue: </w:t>
-      </w:r>
-      <w:r>
-        <w:rPr>
-          <w:b/>
-        </w:rPr>
-        <w:t>$30,000</w:t>
-      </w:r>
-      <w:r>
-        <w:t xml:space="preserve"> (20,000 x 1.5% x $100)</w:t>
-      </w:r>
-    </w:p>
-    <w:p>
-      <w:pPr>
-        <w:pStyle w:val="ListBullet"/>
-        <w:spacing w:after="60"/>
-      </w:pPr>
-      <w:r>
-        <w:t xml:space="preserve">12-month revenue: </w:t>
-      </w:r>
-      <w:r>
-        <w:rPr>
-          <w:b/>
-        </w:rPr>
-        <w:t>$360,000</w:t>
-      </w:r>
-    </w:p>
-    <w:p>
-      <w:pPr>
-        <w:pStyle w:val="ListBullet"/>
-        <w:spacing w:after="60"/>
-      </w:pPr>
-      <w:r>
-        <w:t xml:space="preserve">12-month investment: </w:t>
-      </w:r>
-      <w:r>
-        <w:rPr>
-          <w:b/>
-        </w:rPr>
-        <w:t>$72,000</w:t>
-      </w:r>
-    </w:p>
-    <w:p>
-      <w:pPr>
-        <w:pStyle w:val="ListBullet"/>
-        <w:spacing w:after="60"/>
-      </w:pPr>
-      <w:r>
-        <w:t xml:space="preserve">Net return: </w:t>
-      </w:r>
-      <w:r>
-        <w:rPr>
-          <w:b/>
-        </w:rPr>
-        <w:t>$288,000</w:t>
-      </w:r>
-    </w:p>
-    <w:p>
-      <w:pPr>
-        <w:pStyle w:val="ListBullet"/>
-        <w:spacing w:after="60"/>
-      </w:pPr>
-      <w:r>
-        <w:t xml:space="preserve">SEO ROI: </w:t>
-      </w:r>
-      <w:r>
-        <w:rPr>
-          <w:b/>
-        </w:rPr>
-        <w:t>400%</w:t>
-      </w:r>
-    </w:p>
-    <w:p>
-      <w:pPr>
-        <w:pStyle w:val="ListBullet"/>
-        <w:spacing w:after="60"/>
-      </w:pPr>
-      <w:r>
-        <w:t xml:space="preserve">Return multiple: </w:t>
-      </w:r>
-      <w:r>
-        <w:rPr>
-          <w:b/>
-        </w:rPr>
-        <w:t>5x</w:t>
-      </w:r>
-    </w:p>
-    <w:p>
-      <w:pPr>
-        <w:spacing w:after="120"/>
-      </w:pPr>
-      <w:r>
-        <w:t>So this scenario projects $5 in revenue for every $1 spent on SEO over the year.</w:t>
-      </w:r>
-    </w:p>
-    <w:p>
-      <w:pPr>
-        <w:pStyle w:val="Heading3"/>
-      </w:pPr>
-      <w:r>
-        <w:rPr>
-          <w:color w:val="1A1612"/>
-        </w:rPr>
-        <w:t>CFO mode</w:t>
-      </w:r>
-    </w:p>
-    <w:p>
-      <w:pPr>
-        <w:spacing w:after="120"/>
-      </w:pPr>
-      <w:r>
-        <w:t>Now the finance view. Say your organic program looks like this:</w:t>
-      </w:r>
-    </w:p>
-    <w:p>
-      <w:pPr>
-        <w:pStyle w:val="ListBullet"/>
-        <w:spacing w:after="60"/>
-      </w:pPr>
-      <w:r>
-        <w:t>Total SEO costs: $120,000</w:t>
-      </w:r>
-    </w:p>
-    <w:p>
-      <w:pPr>
-        <w:pStyle w:val="ListBullet"/>
-        <w:spacing w:after="60"/>
-      </w:pPr>
-      <w:r>
-        <w:t>Customers acquired: 300</w:t>
-      </w:r>
-    </w:p>
-    <w:p>
-      <w:pPr>
-        <w:pStyle w:val="ListBullet"/>
-        <w:spacing w:after="60"/>
-      </w:pPr>
-      <w:r>
-        <w:t>Average revenue per customer: $800</w:t>
-      </w:r>
-    </w:p>
-    <w:p>
-      <w:pPr>
-        <w:pStyle w:val="ListBullet"/>
-        <w:spacing w:after="60"/>
-      </w:pPr>
-      <w:r>
-        <w:t>Annual churn: 15%</w:t>
-      </w:r>
-    </w:p>
-    <w:p>
-      <w:pPr>
-        <w:pStyle w:val="ListBullet"/>
-        <w:spacing w:after="60"/>
-      </w:pPr>
-      <w:r>
-        <w:t>Gross margin: 65%</w:t>
-      </w:r>
-    </w:p>
-    <w:p>
-      <w:pPr>
-        <w:pStyle w:val="ListBullet"/>
-        <w:spacing w:after="60"/>
-      </w:pPr>
-      <w:r>
-        <w:t>Discount rate: 10%</w:t>
-      </w:r>
-    </w:p>
-    <w:p>
-      <w:pPr>
-        <w:spacing w:after="120"/>
-      </w:pPr>
-      <w:r>
-        <w:t>The calculator returns:</w:t>
-      </w:r>
-    </w:p>
-    <w:p>
-      <w:pPr>
-        <w:pStyle w:val="ListBullet"/>
-        <w:spacing w:after="60"/>
-      </w:pPr>
-      <w:r>
-        <w:t xml:space="preserve">Retention period: </w:t>
-      </w:r>
-      <w:r>
-        <w:rPr>
-          <w:b/>
-        </w:rPr>
-        <w:t>6.7 years</w:t>
-      </w:r>
-      <w:r>
-        <w:t xml:space="preserve"> (1 ÷ 15%)</w:t>
-      </w:r>
-    </w:p>
-    <w:p>
-      <w:pPr>
-        <w:pStyle w:val="ListBullet"/>
-        <w:spacing w:after="60"/>
-      </w:pPr>
-      <w:r>
-        <w:t xml:space="preserve">Customer LTV: </w:t>
-      </w:r>
-      <w:r>
-        <w:rPr>
-          <w:b/>
-        </w:rPr>
-        <w:t>$3,467</w:t>
-      </w:r>
-    </w:p>
-    <w:p>
-      <w:pPr>
-        <w:pStyle w:val="ListBullet"/>
-        <w:spacing w:after="60"/>
-      </w:pPr>
-      <w:r>
-        <w:t xml:space="preserve">NPV of LTV: </w:t>
-      </w:r>
-      <w:r>
-        <w:rPr>
-          <w:b/>
-        </w:rPr>
-        <w:t>$3,151</w:t>
-      </w:r>
-    </w:p>
-    <w:p>
-      <w:pPr>
-        <w:pStyle w:val="ListBullet"/>
-        <w:spacing w:after="60"/>
-      </w:pPr>
-      <w:r>
-        <w:t xml:space="preserve">CAC: </w:t>
-      </w:r>
-      <w:r>
-        <w:rPr>
-          <w:b/>
-        </w:rPr>
-        <w:t>$400</w:t>
-      </w:r>
-      <w:r>
-        <w:t xml:space="preserve"> ($120,000 ÷ 300)</w:t>
-      </w:r>
-    </w:p>
-    <w:p>
-      <w:pPr>
-        <w:pStyle w:val="ListBullet"/>
-        <w:spacing w:after="60"/>
-      </w:pPr>
-      <w:r>
-        <w:t xml:space="preserve">SEO ROI: </w:t>
-      </w:r>
-      <w:r>
-        <w:rPr>
-          <w:b/>
-        </w:rPr>
-        <w:t>about 688%</w:t>
-      </w:r>
-    </w:p>
-    <w:p>
-      <w:pPr>
-        <w:pStyle w:val="ListBullet"/>
-        <w:spacing w:after="60"/>
-      </w:pPr>
-      <w:r>
-        <w:t xml:space="preserve">LTV:CAC: </w:t>
-      </w:r>
-      <w:r>
-        <w:rPr>
-          <w:b/>
-        </w:rPr>
-        <w:t>8.7:1</w:t>
-      </w:r>
-      <w:r>
-        <w:t xml:space="preserve">, rated </w:t>
-      </w:r>
-      <w:r>
-        <w:rPr>
-          <w:b/>
-        </w:rPr>
-        <w:t>Strong</w:t>
-      </w:r>
-    </w:p>
-    <w:p>
-      <w:pPr>
-        <w:spacing w:after="120"/>
-      </w:pPr>
-      <w:r>
-        <w:t>Same channel, two stories. The first proves the revenue. The second proves the customer is worth far more than it cost to win them, which is the argument finance actually responds to.</w:t>
-      </w:r>
-    </w:p>
-    <w:p>
-      <w:pPr>
-        <w:pStyle w:val="Heading2"/>
-      </w:pPr>
-      <w:r>
-        <w:rPr>
-          <w:color w:val="1A1612"/>
-        </w:rPr>
-        <w:t>How we calculate it (the SEO ROI formula)</w:t>
-      </w:r>
-    </w:p>
-    <w:p>
-      <w:pPr>
-        <w:spacing w:after="120"/>
-      </w:pPr>
-      <w:r>
-        <w:t>No hidden steps. Here is the math behind both modes.</w:t>
-      </w:r>
-    </w:p>
-    <w:p>
-      <w:pPr>
-        <w:spacing w:after="120"/>
-      </w:pPr>
-      <w:r>
-        <w:rPr>
-          <w:b/>
-        </w:rPr>
-        <w:t>Quick ROI mode</w:t>
-      </w:r>
-    </w:p>
-    <w:p>
-      <w:pPr>
-        <w:pStyle w:val="ListBullet"/>
-        <w:spacing w:after="60"/>
-      </w:pPr>
-      <w:r>
-        <w:t>Monthly revenue = Traffic x (Conversion rate ÷ 100) x Average order value</w:t>
-      </w:r>
-    </w:p>
-    <w:p>
-      <w:pPr>
-        <w:pStyle w:val="ListBullet"/>
-        <w:spacing w:after="60"/>
-      </w:pPr>
-      <w:r>
-        <w:t>Campaign revenue = Monthly revenue x Duration</w:t>
-      </w:r>
-    </w:p>
-    <w:p>
-      <w:pPr>
-        <w:pStyle w:val="ListBullet"/>
-        <w:spacing w:after="60"/>
-      </w:pPr>
-      <w:r>
-        <w:t>SEO ROI = ((Campaign revenue − Total investment) ÷ Total investment) x 100</w:t>
-      </w:r>
-    </w:p>
-    <w:p>
-      <w:pPr>
-        <w:pStyle w:val="ListBullet"/>
-        <w:spacing w:after="60"/>
-      </w:pPr>
-      <w:r>
-        <w:t>Return multiple = Campaign revenue ÷ Total investment</w:t>
-      </w:r>
-    </w:p>
-    <w:p>
-      <w:pPr>
-        <w:spacing w:after="120"/>
-      </w:pPr>
-      <w:r>
-        <w:rPr>
-          <w:b/>
-        </w:rPr>
-        <w:t>CFO mode</w:t>
-      </w:r>
-    </w:p>
-    <w:p>
-      <w:pPr>
-        <w:pStyle w:val="ListBullet"/>
-        <w:spacing w:after="60"/>
-      </w:pPr>
-      <w:r>
-        <w:t>LTV = Average revenue per customer x (1 ÷ Churn rate) x Gross margin</w:t>
-      </w:r>
-    </w:p>
-    <w:p>
-      <w:pPr>
-        <w:pStyle w:val="ListBullet"/>
-        <w:spacing w:after="60"/>
-      </w:pPr>
-      <w:r>
-        <w:t>NPV of LTV = LTV ÷ (1 + Discount rate)</w:t>
-      </w:r>
-    </w:p>
-    <w:p>
-      <w:pPr>
-        <w:pStyle w:val="ListBullet"/>
-        <w:spacing w:after="60"/>
-      </w:pPr>
-      <w:r>
-        <w:t>CAC = Total SEO costs ÷ Customers acquired</w:t>
-      </w:r>
-    </w:p>
-    <w:p>
-      <w:pPr>
-        <w:pStyle w:val="ListBullet"/>
-        <w:spacing w:after="60"/>
-      </w:pPr>
-      <w:r>
-        <w:t>SEO ROI = ((NPV of LTV − CAC) ÷ CAC) x 100</w:t>
-      </w:r>
-    </w:p>
-    <w:p>
-      <w:pPr>
-        <w:spacing w:after="120"/>
-      </w:pPr>
-      <w:r>
-        <w:t>The classic SEO ROI formula is simple: revenue from SEO minus the cost of SEO, divided by the cost, times 100. Quick mode runs that on projected revenue. CFO mode runs the same idea on the discounted lifetime value of each customer instead of a single sale.</w:t>
-      </w:r>
-    </w:p>
-    <w:p>
-      <w:pPr>
-        <w:pStyle w:val="Heading2"/>
-      </w:pPr>
-      <w:r>
-        <w:rPr>
-          <w:color w:val="1A1612"/>
-        </w:rPr>
-        <w:t>What counts as a good SEO ROI</w:t>
-      </w:r>
-    </w:p>
-    <w:p>
-      <w:pPr>
-        <w:spacing w:after="120"/>
-      </w:pPr>
-      <w:r>
-        <w:t>It depends on your industry, your competition, and how long you have been at it, so treat any benchmark as an estimate. That said, the rough consensus across the field:</w:t>
-      </w:r>
-    </w:p>
-    <w:p>
-      <w:pPr>
-        <w:pStyle w:val="ListBullet"/>
-        <w:spacing w:after="60"/>
-      </w:pPr>
-      <w:r>
-        <w:t xml:space="preserve">A strong SEO ROI usually lands between </w:t>
-      </w:r>
-      <w:r>
-        <w:rPr>
-          <w:b/>
-        </w:rPr>
-        <w:t>300% and 500%</w:t>
-      </w:r>
-      <w:r>
-        <w:t>, and high-value sectors like SaaS, finance, and legal often report more over two or three years.</w:t>
-      </w:r>
-    </w:p>
-    <w:p>
-      <w:pPr>
-        <w:pStyle w:val="ListBullet"/>
-        <w:spacing w:after="60"/>
-      </w:pPr>
-      <w:r>
-        <w:t xml:space="preserve">On the finance side, an </w:t>
-      </w:r>
-      <w:r>
-        <w:rPr>
-          <w:b/>
-        </w:rPr>
-        <w:t>LTV:CAC ratio of 3:1</w:t>
-      </w:r>
-      <w:r>
-        <w:t xml:space="preserve"> is the floor for a healthy channel. </w:t>
-      </w:r>
-      <w:r>
-        <w:rPr>
-          <w:b/>
-        </w:rPr>
-        <w:t>5:1 is strong. 10:1 is exceptional.</w:t>
-      </w:r>
-    </w:p>
-    <w:p>
-      <w:pPr>
-        <w:pStyle w:val="ListBullet"/>
-        <w:spacing w:after="60"/>
-      </w:pPr>
-      <w:r>
-        <w:t>A ratio far above 10:1 is not always good news. It can mean you are underinvesting and leaving growth on the table.</w:t>
-      </w:r>
-    </w:p>
-    <w:p>
-      <w:r>
-        <w:t xml:space="preserve">Want to see what these numbers look like for a real program? Our </w:t>
-      </w:r>
-      <w:r>
-        <w:rPr>
-          <w:color w:val="5A43D6"/>
-          <w:u w:val="single"/>
-        </w:rPr>
-        <w:t>SEO case studies</w:t>
-      </w:r>
-      <w:r>
-        <w:t xml:space="preserve"> (https://goldflexmarketing.com/case-studies/) show the inputs and outcomes for live enterprise campaigns.</w:t>
-      </w:r>
-    </w:p>
-    <w:p>
-      <w:pPr>
-        <w:pStyle w:val="Heading2"/>
-      </w:pPr>
-      <w:r>
-        <w:rPr>
-          <w:color w:val="1A1612"/>
-        </w:rPr>
-        <w:t>How long before SEO shows a return</w:t>
-      </w:r>
-    </w:p>
-    <w:p>
-      <w:pPr>
-        <w:spacing w:after="120"/>
-      </w:pPr>
-      <w:r>
-        <w:t xml:space="preserve">SEO is a compounding investment, not a switch. Most programs reach a positive return somewhere in the </w:t>
-      </w:r>
-      <w:r>
-        <w:rPr>
-          <w:b/>
-        </w:rPr>
-        <w:t>6 to 12 month</w:t>
-      </w:r>
-      <w:r>
-        <w:t xml:space="preserve"> range, with the strongest results often in year two or three.</w:t>
-      </w:r>
-    </w:p>
-    <w:p>
-      <w:pPr>
-        <w:spacing w:after="120"/>
-      </w:pPr>
-      <w:r>
-        <w:t>You will usually see leading signs sooner: impressions and rankings move first, qualified traffic follows, and revenue is the lagging indicator that trails traffic by a couple of months. When you model a campaign here, setting the duration to 12 months or more gives you a fairer picture than a 3-month window, because the early months carry cost before the revenue catches up.</w:t>
+        <w:t xml:space="preserve"> Always use gross margin so you do not double-count operating costs.</w:t>
       </w:r>
     </w:p>
     <w:p>
@@ -1783,7 +2494,7 @@
         <w:spacing w:after="120"/>
       </w:pPr>
       <w:r>
-        <w:t>It is a tool that estimates the financial return on your SEO spend. You enter numbers like organic traffic, conversion rate, deal value, and budget, and it projects your revenue, net return, and ROI. The enterprise version, like this one, also models customer lifetime value and acquisition cost so finance teams can evaluate SEO the same way they evaluate any investment.</w:t>
+        <w:t>It estimates the financial return on your SEO spend. You enter numbers like organic traffic, conversion rate, deal value, and budget, and it projects your revenue, net return, and ROI. The enterprise version, like this one, also models customer lifetime value and acquisition cost, so finance can judge SEO the same way they judge any investment.</w:t>
       </w:r>
     </w:p>
     <w:p>
@@ -1794,7 +2505,7 @@
         <w:rPr>
           <w:color w:val="1A1612"/>
         </w:rPr>
-        <w:t>How is SEO ROI calculated?</w:t>
+        <w:t>What does the campaign duration field do?</w:t>
       </w:r>
     </w:p>
     <w:p>
@@ -1802,7 +2513,7 @@
         <w:spacing w:after="120"/>
       </w:pPr>
       <w:r>
-        <w:t>The core formula is revenue from SEO minus the cost of SEO, divided by the cost, multiplied by 100 to get a percentage. If you earn $200,000 from organic search and spend $40,000, that is a 400% ROI, or $4 back for every $1 in. This calculator runs that formula on projected revenue in Quick mode, and on the discounted lifetime value of customers in CFO mode.</w:t>
+        <w:t>It sets how many months you are modeling in Quick ROI. Every duration-based result (campaign revenue, campaign investment, net return, ROI %, and return multiple) recalculates the moment you move the slider, and the card labels update too, so a 6-month run reads "6-Month Revenue" and a 24-month run reads "24-Month Revenue". The numbers always match the exact scope your team is approving.</w:t>
       </w:r>
     </w:p>
     <w:p>
@@ -1813,7 +2524,7 @@
         <w:rPr>
           <w:color w:val="1A1612"/>
         </w:rPr>
-        <w:t>What is a good SEO ROI?</w:t>
+        <w:t>What is net return and how is it calculated?</w:t>
       </w:r>
     </w:p>
     <w:p>
@@ -1821,7 +2532,140 @@
         <w:spacing w:after="120"/>
       </w:pPr>
       <w:r>
-        <w:t>Most well-run programs target 300% or higher, and many enterprise campaigns exceed that over time. On a lifetime-value basis, aim for an LTV:CAC ratio of at least 3:1. These are industry estimates, not promises, and your real numbers depend on your margins, churn, and market.</w:t>
+        <w:t>Net return is campaign revenue minus campaign investment: the profit from your SEO program over the duration you set, in dollars. Positive (green) means SEO earns more than it costs over that period. Negative (orange) means it has not crossed into profit yet, which is normal in months 1 to 6. Extend to 12 or 18 months and the picture usually changes.</w:t>
+      </w:r>
+    </w:p>
+    <w:p>
+      <w:pPr>
+        <w:pStyle w:val="Heading3"/>
+      </w:pPr>
+      <w:r>
+        <w:rPr>
+          <w:color w:val="1A1612"/>
+        </w:rPr>
+        <w:t>How is the return multiple different from ROI %?</w:t>
+      </w:r>
+    </w:p>
+    <w:p>
+      <w:pPr>
+        <w:spacing w:after="120"/>
+      </w:pPr>
+      <w:r>
+        <w:t>They measure the same thing two ways. ROI % is (net return ÷ investment) x 100, so 400% means $4 of net profit per $1 in. Return multiple is campaign revenue ÷ investment, so 5.0x means $5 of total revenue per $1 in. The multiple tends to land faster in a meeting. Both update live.</w:t>
+      </w:r>
+    </w:p>
+    <w:p>
+      <w:pPr>
+        <w:pStyle w:val="Heading3"/>
+      </w:pPr>
+      <w:r>
+        <w:rPr>
+          <w:color w:val="1A1612"/>
+        </w:rPr>
+        <w:t>What is the difference between Quick ROI and CFO Mode?</w:t>
+      </w:r>
+    </w:p>
+    <w:p>
+      <w:pPr>
+        <w:spacing w:after="120"/>
+      </w:pPr>
+      <w:r>
+        <w:t>Quick ROI measures campaign revenue return from traffic, conversion rate, order value, spend, and duration. It answers "what will this 12-month campaign earn?" CFO Mode uses unit economics to measure the quality of the customers SEO brings in, by comparing their lifetime value to their acquisition cost. It answers "what is each customer worth and is the cost to win them justified?"</w:t>
+      </w:r>
+    </w:p>
+    <w:p>
+      <w:pPr>
+        <w:pStyle w:val="Heading3"/>
+      </w:pPr>
+      <w:r>
+        <w:rPr>
+          <w:color w:val="1A1612"/>
+        </w:rPr>
+        <w:t>What is a good enterprise SEO ROI?</w:t>
+      </w:r>
+    </w:p>
+    <w:p>
+      <w:pPr>
+        <w:spacing w:after="120"/>
+      </w:pPr>
+      <w:r>
+        <w:t>For Quick ROI, 300% to 500% is strong in years 2 to 3, while 100% to 200% is healthy in year 1 of a new program. For CFO Mode, an LTV:CAC above 3:1 is the minimum for a healthy channel, above 5:1 is strong, and above 10:1 is exceptional. These are industry estimates, not guarantees.</w:t>
+      </w:r>
+    </w:p>
+    <w:p>
+      <w:pPr>
+        <w:pStyle w:val="Heading3"/>
+      </w:pPr>
+      <w:r>
+        <w:rPr>
+          <w:color w:val="1A1612"/>
+        </w:rPr>
+        <w:t>What LTV:CAC ratio should I aim for?</w:t>
+      </w:r>
+    </w:p>
+    <w:p>
+      <w:pPr>
+        <w:spacing w:after="120"/>
+      </w:pPr>
+      <w:r>
+        <w:t>The common minimum is 3:1. Above 5:1 the channel is very efficient and worth scaling. Above 10:1 you are probably holding back one of your best growth levers. Below 2:1, fix retention or organic conversion before spending more.</w:t>
+      </w:r>
+    </w:p>
+    <w:p>
+      <w:pPr>
+        <w:pStyle w:val="Heading3"/>
+      </w:pPr>
+      <w:r>
+        <w:rPr>
+          <w:color w:val="1A1612"/>
+        </w:rPr>
+        <w:t>Should I use first-touch or last-touch attribution?</w:t>
+      </w:r>
+    </w:p>
+    <w:p>
+      <w:pPr>
+        <w:spacing w:after="120"/>
+      </w:pPr>
+      <w:r>
+        <w:t>For a budget case, use first-touch, since it credits SEO for the deals it started. For ongoing reporting, use data-driven attribution in GA4. For a conservative figure, use last-touch. Always say which model you used when you present to finance.</w:t>
+      </w:r>
+    </w:p>
+    <w:p>
+      <w:pPr>
+        <w:pStyle w:val="Heading3"/>
+      </w:pPr>
+      <w:r>
+        <w:rPr>
+          <w:color w:val="1A1612"/>
+        </w:rPr>
+        <w:t>Should I include internal team costs in my SEO investment?</w:t>
+      </w:r>
+    </w:p>
+    <w:p>
+      <w:pPr>
+        <w:spacing w:after="120"/>
+      </w:pPr>
+      <w:r>
+        <w:t>Yes, always. The most common mistake is counting only the agency fee or tools and ignoring internal time. If your SEO manager spends 80% of their week on SEO, 80% of their fully loaded salary belongs in the investment figure. Leaving it out overstates ROI and sets unrealistic expectations.</w:t>
+      </w:r>
+    </w:p>
+    <w:p>
+      <w:pPr>
+        <w:pStyle w:val="Heading3"/>
+      </w:pPr>
+      <w:r>
+        <w:rPr>
+          <w:color w:val="1A1612"/>
+        </w:rPr>
+        <w:t>What churn rate should I use if I do not have data?</w:t>
+      </w:r>
+    </w:p>
+    <w:p>
+      <w:pPr>
+        <w:spacing w:after="120"/>
+      </w:pPr>
+      <w:r>
+        <w:t>Use industry averages as a starting point: SaaS 5% to 12% a year, e-commerce 20% to 35%, B2B services 8% to 15%. Without measured data, pick the higher end of your range for a conservative estimate. Small churn changes move LTV a lot.</w:t>
       </w:r>
     </w:p>
     <w:p>
@@ -1840,7 +2684,7 @@
         <w:spacing w:after="120"/>
       </w:pPr>
       <w:r>
-        <w:t>Plan for 6 to 12 months to reach a clear positive return, with results compounding after that. You should see early signals like rising impressions and rankings within the first few months, well before revenue shows up.</w:t>
+        <w:t>Plan for 6 to 12 months to reach a clear positive return, with results compounding after that. You should see early signals like rising impressions and rankings in the first few months, well before revenue arrives.</w:t>
       </w:r>
     </w:p>
     <w:p>
@@ -1851,7 +2695,7 @@
         <w:rPr>
           <w:color w:val="1A1612"/>
         </w:rPr>
-        <w:t>What is the difference between LTV and CAC?</w:t>
+        <w:t>Can I use this for a single product, category, or market?</w:t>
       </w:r>
     </w:p>
     <w:p>
@@ -1859,26 +2703,7 @@
         <w:spacing w:after="120"/>
       </w:pPr>
       <w:r>
-        <w:t>LTV, or customer lifetime value, is the total margin a customer brings over the whole time they stay with you. CAC, or customer acquisition cost, is what you spent to win that customer. Comparing the two (the LTV:CAC ratio) tells you whether a channel like SEO is actually profitable, not just busy.</w:t>
-      </w:r>
-    </w:p>
-    <w:p>
-      <w:pPr>
-        <w:pStyle w:val="Heading3"/>
-      </w:pPr>
-      <w:r>
-        <w:rPr>
-          <w:color w:val="1A1612"/>
-        </w:rPr>
-        <w:t>What numbers do I need to use the calculator?</w:t>
-      </w:r>
-    </w:p>
-    <w:p>
-      <w:pPr>
-        <w:spacing w:after="120"/>
-      </w:pPr>
-      <w:r>
-        <w:t>For Quick mode: monthly organic traffic, conversion rate, average order or deal value, monthly SEO budget, and a time frame. For CFO mode: total SEO costs, customers acquired from organic, average revenue per customer, churn rate, gross margin, and a discount rate. You can pull most of these from Google Search Console, GA4, and your CRM.</w:t>
+        <w:t>Yes. Filter your inputs to the segment you are looking at. The formulas are the same at any scale, so it works for a whole-company view or a single product line, category, or region.</w:t>
       </w:r>
     </w:p>
     <w:p>
@@ -1897,18 +2722,18 @@
         <w:spacing w:after="120"/>
       </w:pPr>
       <w:r>
-        <w:t>The results are estimates based on the inputs you provide, not guarantees. They are meant for planning and for building a budget case, so the better your inputs, the better the projection. Treat the output as a model, then validate it against your own historical data.</w:t>
+        <w:t>They are estimates based on the inputs you provide, not guarantees. They are built for planning and budget cases, so the better your inputs, the better the projection. Treat the output as a model, then check it against your own history.</w:t>
       </w:r>
     </w:p>
     <w:p>
       <w:pPr>
-        <w:pStyle w:val="Heading3"/>
+        <w:pStyle w:val="Heading2"/>
       </w:pPr>
       <w:r>
         <w:rPr>
           <w:color w:val="1A1612"/>
         </w:rPr>
-        <w:t>How much should an enterprise spend on SEO?</w:t>
+        <w:t>Making the business case for enterprise SEO</w:t>
       </w:r>
     </w:p>
     <w:p>
@@ -1916,18 +2741,15 @@
         <w:spacing w:after="120"/>
       </w:pPr>
       <w:r>
-        <w:t>There is no fixed number. Spend is driven by your competition, your goals, and how much organic revenue is realistically on the table. The smarter approach is to model the return first, then size the budget to hit a target ROI. If you would like help setting that target, see our enterprise SEO services (https://goldflexmarketing.com/enterprise-seo/).</w:t>
+        <w:t>The change that grows SEO budgets is the change from "SEO drives traffic" to "SEO builds customer lifetime value at a lower acquisition cost than almost any other channel, and the net return on this 12-month campaign is $X."</w:t>
       </w:r>
     </w:p>
     <w:p>
       <w:pPr>
-        <w:pStyle w:val="Heading2"/>
+        <w:spacing w:after="120"/>
       </w:pPr>
       <w:r>
-        <w:rPr>
-          <w:color w:val="1A1612"/>
-        </w:rPr>
-        <w:t>Ready to see the real number for your business?</w:t>
+        <w:t>This tool gives you both the words and the numbers for that change. Quick ROI is for the marketing conversation: set the duration to match your contract, then show total revenue and net return. CFO Mode is for the finance conversation: show the LTV:CAC ratio and explain what it means for where capital goes. Both run on data your business already has.</w:t>
       </w:r>
     </w:p>
     <w:p>
@@ -1942,7 +2764,17 @@
         <w:t>book a strategy call</w:t>
       </w:r>
       <w:r>
-        <w:t xml:space="preserve"> (https://goldflexmarketing.com/contact/) and we will pressure-test the assumptions with you.</w:t>
+        <w:t xml:space="preserve"> (https://goldflexmarketing.com/contact/) and we will pressure-test the assumptions with you. If you want to see the full service first, here is how we run </w:t>
+      </w:r>
+      <w:r>
+        <w:rPr>
+          <w:color w:val="5A43D6"/>
+          <w:u w:val="single"/>
+        </w:rPr>
+        <w:t>enterprise SEO</w:t>
+      </w:r>
+      <w:r>
+        <w:t xml:space="preserve"> (https://goldflexmarketing.com/enterprise-seo/).</w:t>
       </w:r>
     </w:p>
     <w:p>

</xml_diff>

<commit_message>
Add primary keyword to H2s and cut repetition in ROI content doc
Works the primary keyword into the How-to-use and Who-it-is-for H2
headings, and removes duplicated points: trims the underinvesting note
from four mentions to two, drops the redundant CFO-insight and
attribution callouts, and tightens the closing section.

Co-Authored-By: Claude Opus 4.8 <noreply@anthropic.com>
Claude-Session: https://claude.ai/code/session_01VAsSMDzAEWRimZVBgGcsUK
</commit_message>
<xml_diff>
--- a/Enterprise-SEO-ROI-Calculator-Content.docx
+++ b/Enterprise-SEO-ROI-Calculator-Content.docx
@@ -1114,7 +1114,7 @@
         <w:t>5:1 to 10:1.</w:t>
       </w:r>
       <w:r>
-        <w:t xml:space="preserve"> Strong. You are probably underinvesting. Each extra dollar of SEO spend at this ratio adds real lifetime value.</w:t>
+        <w:t xml:space="preserve"> Strong. You are probably underinvesting, since each extra dollar of SEO spend at this ratio adds real lifetime value. For most teams, this is the ratio that makes the case for a bigger budget.</w:t>
       </w:r>
     </w:p>
     <w:p>
@@ -1129,41 +1129,9 @@
         <w:t>Above 10:1.</w:t>
       </w:r>
       <w:r>
-        <w:t xml:space="preserve"> Exceptional. Take this to your CFO as the case for a bigger budget.</w:t>
+        <w:t xml:space="preserve"> Exceptional. Take this straight to your CFO.</w:t>
       </w:r>
     </w:p>
-    <w:tbl>
-      <w:tblPr>
-        <w:tblStyle w:val="LightShading-Accent1"/>
-        <w:tblW w:type="auto" w:w="0"/>
-        <w:tblLook w:firstColumn="1" w:firstRow="1" w:lastColumn="0" w:lastRow="0" w:noHBand="0" w:noVBand="1" w:val="04A0"/>
-      </w:tblPr>
-      <w:tblGrid>
-        <w:gridCol w:w="8640"/>
-      </w:tblGrid>
-      <w:tr>
-        <w:tc>
-          <w:tcPr>
-            <w:tcW w:type="dxa" w:w="8640"/>
-          </w:tcPr>
-          <w:p>
-            <w:r>
-              <w:rPr>
-                <w:b/>
-                <w:color w:val="B88600"/>
-              </w:rPr>
-              <w:t>The CFO Mode insight most teams miss</w:t>
-            </w:r>
-          </w:p>
-          <w:p>
-            <w:r>
-              <w:t>If your LTV:CAC is above 5:1, you are almost certainly underspending on SEO. Teams that see this ratio for the first time often realize they have been holding back one of their most efficient acquisition channels. This is the conversation that grows SEO budgets.</w:t>
-            </w:r>
-          </w:p>
-        </w:tc>
-      </w:tr>
-    </w:tbl>
-    <w:p/>
     <w:p>
       <w:pPr>
         <w:pStyle w:val="Heading2"/>
@@ -1172,7 +1140,7 @@
         <w:rPr>
           <w:color w:val="1A1612"/>
         </w:rPr>
-        <w:t>How to use it, step by step</w:t>
+        <w:t>How to use the enterprise SEO ROI calculator</w:t>
       </w:r>
     </w:p>
     <w:p>
@@ -1210,7 +1178,7 @@
         <w:spacing w:after="120"/>
       </w:pPr>
       <w:r>
-        <w:t>Drag the duration slider before you enter anything else. It anchors the whole calculation to the right time frame. A 6-month pilot, a 12-month plan, and a 24-month program are three different conversations.</w:t>
+        <w:t>Drag the duration slider before anything else, since it anchors the whole calculation to the right time frame.</w:t>
       </w:r>
     </w:p>
     <w:p>
@@ -2050,16 +2018,7 @@
         <w:spacing w:after="60"/>
       </w:pPr>
       <w:r>
-        <w:t>For CFO Mode, an LTV:CAC of 3:1 is the floor for a healthy channel. 5:1 is strong. 10:1 is exceptional.</w:t>
-      </w:r>
-    </w:p>
-    <w:p>
-      <w:pPr>
-        <w:pStyle w:val="ListBullet"/>
-        <w:spacing w:after="60"/>
-      </w:pPr>
-      <w:r>
-        <w:t>A ratio far above 10:1 is not always good news. It often means you are underinvesting and leaving growth on the table.</w:t>
+        <w:t>For CFO Mode, an LTV:CAC of 3:1 is the floor for a healthy channel, 5:1 is strong, and 10:1 is exceptional.</w:t>
       </w:r>
     </w:p>
     <w:p>
@@ -2169,41 +2128,9 @@
         <w:spacing w:after="120"/>
       </w:pPr>
       <w:r>
-        <w:t>Enterprise B2B buyers rarely convert on their first organic visit. A typical journey runs 8 to 12 touchpoints over 60 to 180 days. Giving organic search fair credit needs clear, consistent rules.</w:t>
+        <w:t>Enterprise B2B buyers rarely convert on their first organic visit. A typical journey runs 8 to 12 touchpoints over 60 to 180 days, so giving organic search fair credit needs clear, consistent rules. The FAQ below covers which attribution model to pick for which conversation.</w:t>
       </w:r>
     </w:p>
-    <w:tbl>
-      <w:tblPr>
-        <w:tblStyle w:val="LightShading-Accent1"/>
-        <w:tblW w:type="auto" w:w="0"/>
-        <w:tblLook w:firstColumn="1" w:firstRow="1" w:lastColumn="0" w:lastRow="0" w:noHBand="0" w:noVBand="1" w:val="04A0"/>
-      </w:tblPr>
-      <w:tblGrid>
-        <w:gridCol w:w="8640"/>
-      </w:tblGrid>
-      <w:tr>
-        <w:tc>
-          <w:tcPr>
-            <w:tcW w:type="dxa" w:w="8640"/>
-          </w:tcPr>
-          <w:p>
-            <w:r>
-              <w:rPr>
-                <w:b/>
-                <w:color w:val="B88600"/>
-              </w:rPr>
-              <w:t>Attribution recommendation</w:t>
-            </w:r>
-          </w:p>
-          <w:p>
-            <w:r>
-              <w:t>For a budget case with your CFO, use first-touch organic attribution, since it credits SEO for the deals it started. For ongoing reporting, use GA4 data-driven attribution. The truth sits between the two, and showing both signals that you have done the work.</w:t>
-            </w:r>
-          </w:p>
-        </w:tc>
-      </w:tr>
-    </w:tbl>
-    <w:p/>
     <w:p>
       <w:pPr>
         <w:pStyle w:val="Heading2"/>
@@ -2212,7 +2139,7 @@
         <w:rPr>
           <w:color w:val="1A1612"/>
         </w:rPr>
-        <w:t>Who it is for</w:t>
+        <w:t>Who the enterprise SEO ROI calculator is for</w:t>
       </w:r>
     </w:p>
     <w:p>
@@ -2741,15 +2668,7 @@
         <w:spacing w:after="120"/>
       </w:pPr>
       <w:r>
-        <w:t>The change that grows SEO budgets is the change from "SEO drives traffic" to "SEO builds customer lifetime value at a lower acquisition cost than almost any other channel, and the net return on this 12-month campaign is $X."</w:t>
-      </w:r>
-    </w:p>
-    <w:p>
-      <w:pPr>
-        <w:spacing w:after="120"/>
-      </w:pPr>
-      <w:r>
-        <w:t>This tool gives you both the words and the numbers for that change. Quick ROI is for the marketing conversation: set the duration to match your contract, then show total revenue and net return. CFO Mode is for the finance conversation: show the LTV:CAC ratio and explain what it means for where capital goes. Both run on data your business already has.</w:t>
+        <w:t>The change that grows SEO budgets is the change from "SEO drives traffic" to "SEO builds customer lifetime value at a lower acquisition cost than almost any other channel, and the net return on this 12-month campaign is $X." This tool gives you both the words and the numbers to make that case, all from data your business already has.</w:t>
       </w:r>
     </w:p>
     <w:p>

</xml_diff>